<commit_message>
[ADD] CFA Fuentes + PDF
</commit_message>
<xml_diff>
--- a/fuentes/CF3_41730034_DU.docx
+++ b/fuentes/CF3_41730034_DU.docx
@@ -274,6 +274,7 @@
                           <w:p>
                             <w:pPr>
                               <w:pStyle w:val="TituloPortada"/>
+                              <w:ind w:firstLine="0"/>
                               <w:rPr>
                                 <w:sz w:val="56"/>
                               </w:rPr>
@@ -338,6 +339,7 @@
                     <w:p>
                       <w:pPr>
                         <w:pStyle w:val="TituloPortada"/>
+                        <w:ind w:firstLine="0"/>
                         <w:rPr>
                           <w:sz w:val="56"/>
                         </w:rPr>
@@ -581,7 +583,7 @@
             </w:rPr>
             <w:fldChar w:fldCharType="separate"/>
           </w:r>
-          <w:hyperlink w:anchor="_Toc201657216" w:history="1">
+          <w:hyperlink w:anchor="_Toc204004099" w:history="1">
             <w:r>
               <w:rPr>
                 <w:rStyle w:val="Hipervnculo"/>
@@ -608,7 +610,7 @@
                 <w:noProof/>
                 <w:webHidden/>
               </w:rPr>
-              <w:instrText xml:space="preserve"> PAGEREF _Toc201657216 \h </w:instrText>
+              <w:instrText xml:space="preserve"> PAGEREF _Toc204004099 \h </w:instrText>
             </w:r>
             <w:r>
               <w:rPr>
@@ -651,7 +653,7 @@
               <w14:ligatures w14:val="none"/>
             </w:rPr>
           </w:pPr>
-          <w:hyperlink w:anchor="_Toc201657217" w:history="1">
+          <w:hyperlink w:anchor="_Toc204004100" w:history="1">
             <w:r>
               <w:rPr>
                 <w:rStyle w:val="Hipervnculo"/>
@@ -696,7 +698,7 @@
                 <w:noProof/>
                 <w:webHidden/>
               </w:rPr>
-              <w:instrText xml:space="preserve"> PAGEREF _Toc201657217 \h </w:instrText>
+              <w:instrText xml:space="preserve"> PAGEREF _Toc204004100 \h </w:instrText>
             </w:r>
             <w:r>
               <w:rPr>
@@ -738,7 +740,7 @@
               <w14:ligatures w14:val="none"/>
             </w:rPr>
           </w:pPr>
-          <w:hyperlink w:anchor="_Toc201657218" w:history="1">
+          <w:hyperlink w:anchor="_Toc204004101" w:history="1">
             <w:r>
               <w:rPr>
                 <w:rStyle w:val="Hipervnculo"/>
@@ -783,7 +785,7 @@
               <w:rPr>
                 <w:webHidden/>
               </w:rPr>
-              <w:instrText xml:space="preserve"> PAGEREF _Toc201657218 \h </w:instrText>
+              <w:instrText xml:space="preserve"> PAGEREF _Toc204004101 \h </w:instrText>
             </w:r>
             <w:r>
               <w:rPr>
@@ -821,7 +823,7 @@
               <w14:ligatures w14:val="none"/>
             </w:rPr>
           </w:pPr>
-          <w:hyperlink w:anchor="_Toc201657219" w:history="1">
+          <w:hyperlink w:anchor="_Toc204004102" w:history="1">
             <w:r>
               <w:rPr>
                 <w:rStyle w:val="Hipervnculo"/>
@@ -866,7 +868,7 @@
               <w:rPr>
                 <w:webHidden/>
               </w:rPr>
-              <w:instrText xml:space="preserve"> PAGEREF _Toc201657219 \h </w:instrText>
+              <w:instrText xml:space="preserve"> PAGEREF _Toc204004102 \h </w:instrText>
             </w:r>
             <w:r>
               <w:rPr>
@@ -905,7 +907,7 @@
               <w14:ligatures w14:val="none"/>
             </w:rPr>
           </w:pPr>
-          <w:hyperlink w:anchor="_Toc201657220" w:history="1">
+          <w:hyperlink w:anchor="_Toc204004103" w:history="1">
             <w:r>
               <w:rPr>
                 <w:rStyle w:val="Hipervnculo"/>
@@ -950,7 +952,7 @@
                 <w:noProof/>
                 <w:webHidden/>
               </w:rPr>
-              <w:instrText xml:space="preserve"> PAGEREF _Toc201657220 \h </w:instrText>
+              <w:instrText xml:space="preserve"> PAGEREF _Toc204004103 \h </w:instrText>
             </w:r>
             <w:r>
               <w:rPr>
@@ -992,7 +994,7 @@
               <w14:ligatures w14:val="none"/>
             </w:rPr>
           </w:pPr>
-          <w:hyperlink w:anchor="_Toc201657222" w:history="1">
+          <w:hyperlink w:anchor="_Toc204004105" w:history="1">
             <w:r>
               <w:rPr>
                 <w:rStyle w:val="Hipervnculo"/>
@@ -1037,7 +1039,7 @@
               <w:rPr>
                 <w:webHidden/>
               </w:rPr>
-              <w:instrText xml:space="preserve"> PAGEREF _Toc201657222 \h </w:instrText>
+              <w:instrText xml:space="preserve"> PAGEREF _Toc204004105 \h </w:instrText>
             </w:r>
             <w:r>
               <w:rPr>
@@ -1076,7 +1078,7 @@
               <w14:ligatures w14:val="none"/>
             </w:rPr>
           </w:pPr>
-          <w:hyperlink w:anchor="_Toc201657223" w:history="1">
+          <w:hyperlink w:anchor="_Toc204004106" w:history="1">
             <w:r>
               <w:rPr>
                 <w:rStyle w:val="Hipervnculo"/>
@@ -1121,7 +1123,7 @@
                 <w:noProof/>
                 <w:webHidden/>
               </w:rPr>
-              <w:instrText xml:space="preserve"> PAGEREF _Toc201657223 \h </w:instrText>
+              <w:instrText xml:space="preserve"> PAGEREF _Toc204004106 \h </w:instrText>
             </w:r>
             <w:r>
               <w:rPr>
@@ -1163,7 +1165,7 @@
               <w14:ligatures w14:val="none"/>
             </w:rPr>
           </w:pPr>
-          <w:hyperlink w:anchor="_Toc201657225" w:history="1">
+          <w:hyperlink w:anchor="_Toc204004108" w:history="1">
             <w:r>
               <w:rPr>
                 <w:rStyle w:val="Hipervnculo"/>
@@ -1208,7 +1210,7 @@
               <w:rPr>
                 <w:webHidden/>
               </w:rPr>
-              <w:instrText xml:space="preserve"> PAGEREF _Toc201657225 \h </w:instrText>
+              <w:instrText xml:space="preserve"> PAGEREF _Toc204004108 \h </w:instrText>
             </w:r>
             <w:r>
               <w:rPr>
@@ -1246,7 +1248,7 @@
               <w14:ligatures w14:val="none"/>
             </w:rPr>
           </w:pPr>
-          <w:hyperlink w:anchor="_Toc201657226" w:history="1">
+          <w:hyperlink w:anchor="_Toc204004109" w:history="1">
             <w:r>
               <w:rPr>
                 <w:rStyle w:val="Hipervnculo"/>
@@ -1291,7 +1293,7 @@
               <w:rPr>
                 <w:webHidden/>
               </w:rPr>
-              <w:instrText xml:space="preserve"> PAGEREF _Toc201657226 \h </w:instrText>
+              <w:instrText xml:space="preserve"> PAGEREF _Toc204004109 \h </w:instrText>
             </w:r>
             <w:r>
               <w:rPr>
@@ -1330,7 +1332,7 @@
               <w14:ligatures w14:val="none"/>
             </w:rPr>
           </w:pPr>
-          <w:hyperlink w:anchor="_Toc201657227" w:history="1">
+          <w:hyperlink w:anchor="_Toc204004110" w:history="1">
             <w:r>
               <w:rPr>
                 <w:rStyle w:val="Hipervnculo"/>
@@ -1354,21 +1356,7 @@
                 <w:rStyle w:val="Hipervnculo"/>
                 <w:noProof/>
               </w:rPr>
-              <w:t xml:space="preserve">Estrategia de Atención Integrada a las Enfermedades Prevalentes de la </w:t>
-            </w:r>
-            <w:r>
-              <w:rPr>
-                <w:rStyle w:val="Hipervnculo"/>
-                <w:noProof/>
-              </w:rPr>
-              <w:t xml:space="preserve">   </w:t>
-            </w:r>
-            <w:r>
-              <w:rPr>
-                <w:rStyle w:val="Hipervnculo"/>
-                <w:noProof/>
-              </w:rPr>
-              <w:t>Infancia (AIEPI)</w:t>
+              <w:t>Estrategia de Atención Integrada a las Enfermedades Prevalentes de la Infancia (AIEPI)</w:t>
             </w:r>
             <w:r>
               <w:rPr>
@@ -1389,7 +1377,7 @@
                 <w:noProof/>
                 <w:webHidden/>
               </w:rPr>
-              <w:instrText xml:space="preserve"> PAGEREF _Toc201657227 \h </w:instrText>
+              <w:instrText xml:space="preserve"> PAGEREF _Toc204004110 \h </w:instrText>
             </w:r>
             <w:r>
               <w:rPr>
@@ -1432,7 +1420,7 @@
               <w14:ligatures w14:val="none"/>
             </w:rPr>
           </w:pPr>
-          <w:hyperlink w:anchor="_Toc201657228" w:history="1">
+          <w:hyperlink w:anchor="_Toc204004111" w:history="1">
             <w:r>
               <w:rPr>
                 <w:rStyle w:val="Hipervnculo"/>
@@ -1477,7 +1465,7 @@
                 <w:noProof/>
                 <w:webHidden/>
               </w:rPr>
-              <w:instrText xml:space="preserve"> PAGEREF _Toc201657228 \h </w:instrText>
+              <w:instrText xml:space="preserve"> PAGEREF _Toc204004111 \h </w:instrText>
             </w:r>
             <w:r>
               <w:rPr>
@@ -1520,7 +1508,7 @@
               <w14:ligatures w14:val="none"/>
             </w:rPr>
           </w:pPr>
-          <w:hyperlink w:anchor="_Toc201657229" w:history="1">
+          <w:hyperlink w:anchor="_Toc204004112" w:history="1">
             <w:r>
               <w:rPr>
                 <w:rStyle w:val="Hipervnculo"/>
@@ -1547,7 +1535,7 @@
                 <w:noProof/>
                 <w:webHidden/>
               </w:rPr>
-              <w:instrText xml:space="preserve"> PAGEREF _Toc201657229 \h </w:instrText>
+              <w:instrText xml:space="preserve"> PAGEREF _Toc204004112 \h </w:instrText>
             </w:r>
             <w:r>
               <w:rPr>
@@ -1590,7 +1578,7 @@
               <w14:ligatures w14:val="none"/>
             </w:rPr>
           </w:pPr>
-          <w:hyperlink w:anchor="_Toc201657230" w:history="1">
+          <w:hyperlink w:anchor="_Toc204004113" w:history="1">
             <w:r>
               <w:rPr>
                 <w:rStyle w:val="Hipervnculo"/>
@@ -1617,7 +1605,7 @@
                 <w:noProof/>
                 <w:webHidden/>
               </w:rPr>
-              <w:instrText xml:space="preserve"> PAGEREF _Toc201657230 \h </w:instrText>
+              <w:instrText xml:space="preserve"> PAGEREF _Toc204004113 \h </w:instrText>
             </w:r>
             <w:r>
               <w:rPr>
@@ -1660,7 +1648,7 @@
               <w14:ligatures w14:val="none"/>
             </w:rPr>
           </w:pPr>
-          <w:hyperlink w:anchor="_Toc201657231" w:history="1">
+          <w:hyperlink w:anchor="_Toc204004114" w:history="1">
             <w:r>
               <w:rPr>
                 <w:rStyle w:val="Hipervnculo"/>
@@ -1687,7 +1675,7 @@
                 <w:noProof/>
                 <w:webHidden/>
               </w:rPr>
-              <w:instrText xml:space="preserve"> PAGEREF _Toc201657231 \h </w:instrText>
+              <w:instrText xml:space="preserve"> PAGEREF _Toc204004114 \h </w:instrText>
             </w:r>
             <w:r>
               <w:rPr>
@@ -1730,7 +1718,7 @@
               <w14:ligatures w14:val="none"/>
             </w:rPr>
           </w:pPr>
-          <w:hyperlink w:anchor="_Toc201657232" w:history="1">
+          <w:hyperlink w:anchor="_Toc204004115" w:history="1">
             <w:r>
               <w:rPr>
                 <w:rStyle w:val="Hipervnculo"/>
@@ -1758,7 +1746,7 @@
                 <w:noProof/>
                 <w:webHidden/>
               </w:rPr>
-              <w:instrText xml:space="preserve"> PAGEREF _Toc201657232 \h </w:instrText>
+              <w:instrText xml:space="preserve"> PAGEREF _Toc204004115 \h </w:instrText>
             </w:r>
             <w:r>
               <w:rPr>
@@ -1801,7 +1789,7 @@
               <w14:ligatures w14:val="none"/>
             </w:rPr>
           </w:pPr>
-          <w:hyperlink w:anchor="_Toc201657233" w:history="1">
+          <w:hyperlink w:anchor="_Toc204004116" w:history="1">
             <w:r>
               <w:rPr>
                 <w:rStyle w:val="Hipervnculo"/>
@@ -1828,7 +1816,7 @@
                 <w:noProof/>
                 <w:webHidden/>
               </w:rPr>
-              <w:instrText xml:space="preserve"> PAGEREF _Toc201657233 \h </w:instrText>
+              <w:instrText xml:space="preserve"> PAGEREF _Toc204004116 \h </w:instrText>
             </w:r>
             <w:r>
               <w:rPr>
@@ -1895,7 +1883,7 @@
         </w:numPr>
         <w:ind w:left="1068"/>
       </w:pPr>
-      <w:bookmarkStart w:id="0" w:name="_Toc201657216"/>
+      <w:bookmarkStart w:id="0" w:name="_Toc204004099"/>
       <w:r>
         <w:lastRenderedPageBreak/>
         <w:t>Introducción</w:t>
@@ -2130,7 +2118,19 @@
               <w:rPr>
                 <w:lang w:val="es-419" w:eastAsia="es-CO"/>
               </w:rPr>
-              <w:t>Bienvenidos al programa de Integración de la Estrategia de Salud Pública Integrada (ESPI) según el modelo de gestión local. Este espacio tiene como objetivo fortalecer la promoción de la salud, entendida como un proceso esencial para potenciar las capacidades individuales y colectivas, mejorar la calidad de vida y prevenir enfermedades, más allá del enfoque tradicional centrado únicamente en la atención médica.</w:t>
+              <w:t xml:space="preserve">Bienvenidos al </w:t>
+            </w:r>
+            <w:r>
+              <w:rPr>
+                <w:lang w:val="es-419" w:eastAsia="es-CO"/>
+              </w:rPr>
+              <w:t>componente formativo</w:t>
+            </w:r>
+            <w:r>
+              <w:rPr>
+                <w:lang w:val="es-419" w:eastAsia="es-CO"/>
+              </w:rPr>
+              <w:t xml:space="preserve"> de Integración de la Estrategia de Salud Pública Integrada (ESPI) según modelo de gestión local. Este espacio tiene como objetivo fortalecer la promoción de la salud, entendida como un proceso esencial para potenciar las capacidades individuales y colectivas, mejorar la calidad de vida y prevenir enfermedades, más allá del enfoque tradicional centrado únicamente en la atención médica.</w:t>
             </w:r>
           </w:p>
           <w:p>
@@ -2310,7 +2310,7 @@
       <w:pPr>
         <w:pStyle w:val="Ttulo1"/>
       </w:pPr>
-      <w:bookmarkStart w:id="1" w:name="_Toc201657217"/>
+      <w:bookmarkStart w:id="1" w:name="_Toc204004100"/>
       <w:r>
         <w:lastRenderedPageBreak/>
         <w:t>Desarrollo humano sostenible y calidad de vida</w:t>
@@ -2327,7 +2327,19 @@
         <w:rPr>
           <w:lang w:val="es-419" w:eastAsia="es-CO"/>
         </w:rPr>
-        <w:t>El desarrollo humano sostenible es un proceso que busca ampliar las oportunidades y capacidades de las personas para alcanzar una vida digna, saludable y plena, según el programa de las naciones unidas para el desarrollo (PNUD, 1990), el desarrollo humano implica vivir saludablemente, adquirir conocimientos y contar con los recursos necesarios para una vida decente. Cuando estas condiciones no se garantizan, otras oportunidades y derechos permanecen fuera del alcance.</w:t>
+        <w:t xml:space="preserve">El desarrollo humano sostenible es un proceso que busca ampliar las oportunidades y capacidades de las personas para alcanzar una vida digna, saludable y plena, según el programa de las </w:t>
+      </w:r>
+      <w:r>
+        <w:rPr>
+          <w:lang w:val="es-419" w:eastAsia="es-CO"/>
+        </w:rPr>
+        <w:t>Naciones Unidas</w:t>
+      </w:r>
+      <w:r>
+        <w:rPr>
+          <w:lang w:val="es-419" w:eastAsia="es-CO"/>
+        </w:rPr>
+        <w:t xml:space="preserve"> para el desarrollo (PNUD, 1990), el desarrollo humano implica vivir saludablemente, adquirir conocimientos y contar con los recursos necesarios para una vida decente. Cuando estas condiciones no se garantizan, otras oportunidades y derechos permanecen fuera del alcance.</w:t>
       </w:r>
     </w:p>
     <w:p>
@@ -2530,7 +2542,7 @@
       <w:pPr>
         <w:pStyle w:val="Ttulo2"/>
       </w:pPr>
-      <w:bookmarkStart w:id="2" w:name="_Toc201657218"/>
+      <w:bookmarkStart w:id="2" w:name="_Toc204004101"/>
       <w:r>
         <w:t>Los derechos humanos y su aporte al desarrollo humano</w:t>
       </w:r>
@@ -2576,7 +2588,31 @@
         <w:rPr>
           <w:lang w:eastAsia="es-CO"/>
         </w:rPr>
-        <w:t>El desarrollo humano como derecho es una visión relativamente reciente, aunque desde antes se abordaban de manera implícita algunos aspectos relacionados. Fue en 1986, mediante la declaración sobre el derecho al desarrollo de las naciones unidas, donde se reconoció formalmente este derecho, afirmando que todas las personas tienen derecho a participar, contribuir y disfrutar del desarrollo económico, social, cultural y político.</w:t>
+        <w:t xml:space="preserve">El desarrollo humano como derecho es una visión relativamente reciente, aunque desde antes se abordaban de manera implícita algunos aspectos relacionados. Fue en 1986, mediante la declaración sobre el derecho al desarrollo de las </w:t>
+      </w:r>
+      <w:r>
+        <w:rPr>
+          <w:lang w:eastAsia="es-CO"/>
+        </w:rPr>
+        <w:t>N</w:t>
+      </w:r>
+      <w:r>
+        <w:rPr>
+          <w:lang w:eastAsia="es-CO"/>
+        </w:rPr>
+        <w:t xml:space="preserve">aciones </w:t>
+      </w:r>
+      <w:r>
+        <w:rPr>
+          <w:lang w:eastAsia="es-CO"/>
+        </w:rPr>
+        <w:t>U</w:t>
+      </w:r>
+      <w:r>
+        <w:rPr>
+          <w:lang w:eastAsia="es-CO"/>
+        </w:rPr>
+        <w:t>nidas, donde se reconoció formalmente este derecho, afirmando que todas las personas tienen derecho a participar, contribuir y disfrutar del desarrollo económico, social, cultural y político.</w:t>
       </w:r>
     </w:p>
     <w:p>
@@ -3002,30 +3038,23 @@
           <w:bCs/>
           <w:lang w:eastAsia="es-CO"/>
         </w:rPr>
-        <w:t>Relación con la constitución política de 1991:</w:t>
-      </w:r>
-      <w:r>
-        <w:rPr>
-          <w:lang w:eastAsia="es-CO"/>
-        </w:rPr>
-        <w:t> en Colombia, la constitución política de 1991 reconoce los derechos humanos como pilar fundamental, destacando en el Artículo 5:</w:t>
-      </w:r>
-    </w:p>
-    <w:p>
-      <w:pPr>
+        <w:t xml:space="preserve">Relación con la </w:t>
+      </w:r>
+      <w:r>
         <w:rPr>
           <w:b/>
           <w:bCs/>
           <w:lang w:eastAsia="es-CO"/>
         </w:rPr>
-      </w:pPr>
+        <w:t>C</w:t>
+      </w:r>
       <w:r>
         <w:rPr>
           <w:b/>
           <w:bCs/>
           <w:lang w:eastAsia="es-CO"/>
         </w:rPr>
-        <w:t>“</w:t>
+        <w:t xml:space="preserve">onstitución </w:t>
       </w:r>
       <w:r>
         <w:rPr>
@@ -3033,7 +3062,7 @@
           <w:bCs/>
           <w:lang w:eastAsia="es-CO"/>
         </w:rPr>
-        <w:t>El estado reconoce, sin discriminación alguna, la primacía de los derechos inalienables de la persona y ampara a la familia como institución básica de la sociedad</w:t>
+        <w:t>P</w:t>
       </w:r>
       <w:r>
         <w:rPr>
@@ -3041,14 +3070,93 @@
           <w:bCs/>
           <w:lang w:eastAsia="es-CO"/>
         </w:rPr>
-        <w:t>”</w:t>
-      </w:r>
-      <w:r>
+        <w:t>olítica de 1991:</w:t>
+      </w:r>
+      <w:r>
+        <w:rPr>
+          <w:lang w:eastAsia="es-CO"/>
+        </w:rPr>
+        <w:t xml:space="preserve"> en Colombia, la </w:t>
+      </w:r>
+      <w:r>
+        <w:rPr>
+          <w:lang w:eastAsia="es-CO"/>
+        </w:rPr>
+        <w:t>C</w:t>
+      </w:r>
+      <w:r>
+        <w:rPr>
+          <w:lang w:eastAsia="es-CO"/>
+        </w:rPr>
+        <w:t xml:space="preserve">onstitución </w:t>
+      </w:r>
+      <w:r>
+        <w:rPr>
+          <w:lang w:eastAsia="es-CO"/>
+        </w:rPr>
+        <w:t>P</w:t>
+      </w:r>
+      <w:r>
+        <w:rPr>
+          <w:lang w:eastAsia="es-CO"/>
+        </w:rPr>
+        <w:t>olítica de 1991 reconoce los derechos humanos como pilar fundamental, destacando en el Artículo 5:</w:t>
+      </w:r>
+    </w:p>
+    <w:p>
+      <w:pPr>
         <w:rPr>
           <w:b/>
           <w:bCs/>
           <w:lang w:eastAsia="es-CO"/>
         </w:rPr>
+      </w:pPr>
+      <w:r>
+        <w:rPr>
+          <w:b/>
+          <w:bCs/>
+          <w:lang w:eastAsia="es-CO"/>
+        </w:rPr>
+        <w:t>“</w:t>
+      </w:r>
+      <w:r>
+        <w:rPr>
+          <w:b/>
+          <w:bCs/>
+          <w:lang w:eastAsia="es-CO"/>
+        </w:rPr>
+        <w:t xml:space="preserve">El </w:t>
+      </w:r>
+      <w:r>
+        <w:rPr>
+          <w:b/>
+          <w:bCs/>
+          <w:lang w:eastAsia="es-CO"/>
+        </w:rPr>
+        <w:t>E</w:t>
+      </w:r>
+      <w:r>
+        <w:rPr>
+          <w:b/>
+          <w:bCs/>
+          <w:lang w:eastAsia="es-CO"/>
+        </w:rPr>
+        <w:t>stado reconoce, sin discriminación alguna, la primacía de los derechos inalienables de la persona y ampara a la familia como institución básica de la sociedad</w:t>
+      </w:r>
+      <w:r>
+        <w:rPr>
+          <w:b/>
+          <w:bCs/>
+          <w:lang w:eastAsia="es-CO"/>
+        </w:rPr>
+        <w:t>”</w:t>
+      </w:r>
+      <w:r>
+        <w:rPr>
+          <w:b/>
+          <w:bCs/>
+          <w:lang w:eastAsia="es-CO"/>
+        </w:rPr>
         <w:t>.</w:t>
       </w:r>
     </w:p>
@@ -3070,7 +3178,7 @@
       <w:pPr>
         <w:pStyle w:val="Ttulo2"/>
       </w:pPr>
-      <w:bookmarkStart w:id="3" w:name="_Toc201657219"/>
+      <w:bookmarkStart w:id="3" w:name="_Toc204004102"/>
       <w:r>
         <w:t>Promoción de la salud, determinantes sociales y su relación con el desarrollo humano</w:t>
       </w:r>
@@ -3631,7 +3739,7 @@
       <w:pPr>
         <w:pStyle w:val="Ttulo1"/>
       </w:pPr>
-      <w:bookmarkStart w:id="4" w:name="_Toc201657220"/>
+      <w:bookmarkStart w:id="4" w:name="_Toc204004103"/>
       <w:r>
         <w:lastRenderedPageBreak/>
         <w:t>Políticas que favorecen los entornos saludables</w:t>
@@ -3648,20 +3756,104 @@
         <w:rPr>
           <w:lang w:eastAsia="es-CO"/>
         </w:rPr>
-        <w:t>Los Objetivos de Desarrollo del Milenio (ODM): un compromiso global para promover el desarrollo humano; se entienden como Colombia, en articulación con el sistema de naciones unidas, ha venido implementando desde 2003 una agenda nacional para cumplir con los compromisos adquiridos en el marco de los Objetivos de Desarrollo del Milenio (ODM); esta agenda, adaptada y formalizada mediante el CONPES Social 91 (2005), planteó un conjunto de propuestas y acciones para avanzar en el logro de las metas acordadas a nivel internacional, centradas en reducir la pobreza, mejorar la salud, la educación y garantizar el desarrollo humano sostenible.</w:t>
-      </w:r>
-    </w:p>
-    <w:p>
-      <w:pPr>
-        <w:rPr>
-          <w:lang w:eastAsia="es-CO"/>
-        </w:rPr>
-      </w:pPr>
-      <w:r>
-        <w:rPr>
-          <w:lang w:eastAsia="es-CO"/>
-        </w:rPr>
-        <w:t>Estos compromisos surgieron como respuesta a los desafíos globales de desarrollo social, abordados en diversas conferencias internacionales organizadas por las naciones unidas en los años 90, en septiembre del 2000, 189 estados miembros de la ONU, junto con 147 jefes de estado y de gobierno, firmaron la declaración del milenio, estableciendo un pacto mundial para erradicar la pobreza extrema y avanzar en la equidad social, bajo una visión compartida de los derechos humanos, la democracia, la equidad y la sostenibilidad ambiental.</w:t>
+        <w:t xml:space="preserve">Los Objetivos de Desarrollo del Milenio (ODM): un compromiso global para promover el desarrollo humano; se entienden </w:t>
+      </w:r>
+      <w:r>
+        <w:rPr>
+          <w:lang w:eastAsia="es-CO"/>
+        </w:rPr>
+        <w:t>có</w:t>
+      </w:r>
+      <w:r>
+        <w:rPr>
+          <w:lang w:eastAsia="es-CO"/>
+        </w:rPr>
+        <w:t xml:space="preserve">mo Colombia, en articulación con el sistema de </w:t>
+      </w:r>
+      <w:r>
+        <w:rPr>
+          <w:lang w:eastAsia="es-CO"/>
+        </w:rPr>
+        <w:t>N</w:t>
+      </w:r>
+      <w:r>
+        <w:rPr>
+          <w:lang w:eastAsia="es-CO"/>
+        </w:rPr>
+        <w:t xml:space="preserve">aciones </w:t>
+      </w:r>
+      <w:r>
+        <w:rPr>
+          <w:lang w:eastAsia="es-CO"/>
+        </w:rPr>
+        <w:t>U</w:t>
+      </w:r>
+      <w:r>
+        <w:rPr>
+          <w:lang w:eastAsia="es-CO"/>
+        </w:rPr>
+        <w:t>nidas, ha venido implementando desde 2003 una agenda nacional para cumplir con los compromisos adquiridos en el marco de los Objetivos de Desarrollo del Milenio (ODM); esta agenda, adaptada y formalizada mediante el CONPES Social 91 (2005), planteó un conjunto de propuestas y acciones para avanzar en el logro de las metas acordadas a nivel internacional, centradas en reducir la pobreza, mejorar la salud, la educación y garantizar el desarrollo humano sostenible.</w:t>
+      </w:r>
+    </w:p>
+    <w:p>
+      <w:pPr>
+        <w:rPr>
+          <w:lang w:eastAsia="es-CO"/>
+        </w:rPr>
+      </w:pPr>
+      <w:r>
+        <w:rPr>
+          <w:lang w:eastAsia="es-CO"/>
+        </w:rPr>
+        <w:t xml:space="preserve">Estos compromisos surgieron como respuesta a los desafíos globales de desarrollo social, abordados en diversas conferencias internacionales organizadas por las </w:t>
+      </w:r>
+      <w:r>
+        <w:rPr>
+          <w:lang w:eastAsia="es-CO"/>
+        </w:rPr>
+        <w:t xml:space="preserve">Naciones Unidas </w:t>
+      </w:r>
+      <w:r>
+        <w:rPr>
+          <w:lang w:eastAsia="es-CO"/>
+        </w:rPr>
+        <w:t xml:space="preserve">en los años 90, en septiembre del 2000, 189 </w:t>
+      </w:r>
+      <w:r>
+        <w:rPr>
+          <w:lang w:eastAsia="es-CO"/>
+        </w:rPr>
+        <w:t>E</w:t>
+      </w:r>
+      <w:r>
+        <w:rPr>
+          <w:lang w:eastAsia="es-CO"/>
+        </w:rPr>
+        <w:t xml:space="preserve">stados miembros de la ONU, junto con 147 jefes de </w:t>
+      </w:r>
+      <w:r>
+        <w:rPr>
+          <w:lang w:eastAsia="es-CO"/>
+        </w:rPr>
+        <w:t>E</w:t>
+      </w:r>
+      <w:r>
+        <w:rPr>
+          <w:lang w:eastAsia="es-CO"/>
+        </w:rPr>
+        <w:t xml:space="preserve">stado y de </w:t>
+      </w:r>
+      <w:r>
+        <w:rPr>
+          <w:lang w:eastAsia="es-CO"/>
+        </w:rPr>
+        <w:t>G</w:t>
+      </w:r>
+      <w:r>
+        <w:rPr>
+          <w:lang w:eastAsia="es-CO"/>
+        </w:rPr>
+        <w:t>obierno, firmaron la declaración del milenio, estableciendo un pacto mundial para erradicar la pobreza extrema y avanzar en la equidad social, bajo una visión compartida de los derechos humanos, la democracia, la equidad y la sostenibilidad ambiental.</w:t>
       </w:r>
     </w:p>
     <w:p>
@@ -3849,20 +4041,40 @@
           <w:bCs/>
           <w:lang w:eastAsia="es-CO"/>
         </w:rPr>
-        <w:t>Estrategias para alcanzar los objetivos del milenio en américa latina</w:t>
-      </w:r>
-    </w:p>
-    <w:p>
-      <w:pPr>
-        <w:rPr>
-          <w:lang w:eastAsia="es-CO"/>
-        </w:rPr>
-      </w:pPr>
-      <w:r>
-        <w:rPr>
-          <w:lang w:eastAsia="es-CO"/>
-        </w:rPr>
-        <w:t>Desde la mirada de américa latina, lograr los ODM requiere de esfuerzos conjuntos y sostenidos, a través de estrategias como:</w:t>
+        <w:t xml:space="preserve">Estrategias para alcanzar los objetivos del milenio en </w:t>
+      </w:r>
+      <w:r>
+        <w:rPr>
+          <w:b/>
+          <w:bCs/>
+          <w:lang w:eastAsia="es-CO"/>
+        </w:rPr>
+        <w:t>América Latina</w:t>
+      </w:r>
+    </w:p>
+    <w:p>
+      <w:pPr>
+        <w:rPr>
+          <w:lang w:eastAsia="es-CO"/>
+        </w:rPr>
+      </w:pPr>
+      <w:r>
+        <w:rPr>
+          <w:lang w:eastAsia="es-CO"/>
+        </w:rPr>
+        <w:t xml:space="preserve">Desde la mirada de </w:t>
+      </w:r>
+      <w:r>
+        <w:rPr>
+          <w:lang w:eastAsia="es-CO"/>
+        </w:rPr>
+        <w:t>América Latina</w:t>
+      </w:r>
+      <w:r>
+        <w:rPr>
+          <w:lang w:eastAsia="es-CO"/>
+        </w:rPr>
+        <w:t>, lograr los ODM requiere de esfuerzos conjuntos y sostenidos, a través de estrategias como:</w:t>
       </w:r>
     </w:p>
     <w:p>
@@ -4160,17 +4372,19 @@
         </w:rPr>
       </w:pPr>
       <w:bookmarkStart w:id="5" w:name="_Toc201657221"/>
+      <w:bookmarkStart w:id="6" w:name="_Toc204004104"/>
       <w:bookmarkEnd w:id="5"/>
+      <w:bookmarkEnd w:id="6"/>
     </w:p>
     <w:p>
       <w:pPr>
         <w:pStyle w:val="Ttulo2"/>
       </w:pPr>
-      <w:bookmarkStart w:id="6" w:name="_Toc201657222"/>
+      <w:bookmarkStart w:id="7" w:name="_Toc204004105"/>
       <w:r>
         <w:t>Directrices nacionales que favorecen el desarrollo de las estrategias</w:t>
       </w:r>
-      <w:bookmarkEnd w:id="6"/>
+      <w:bookmarkEnd w:id="7"/>
     </w:p>
     <w:p>
       <w:pPr>
@@ -4208,7 +4422,19 @@
         <w:rPr>
           <w:lang w:eastAsia="es-CO"/>
         </w:rPr>
-        <w:t>Sistema de protección social y enfoque del manejo social del riesgo, La Ley 789 de 2002, lo define como:</w:t>
+        <w:t xml:space="preserve">Sistema de protección social y enfoque del manejo social del riesgo, </w:t>
+      </w:r>
+      <w:r>
+        <w:rPr>
+          <w:lang w:eastAsia="es-CO"/>
+        </w:rPr>
+        <w:t>l</w:t>
+      </w:r>
+      <w:r>
+        <w:rPr>
+          <w:lang w:eastAsia="es-CO"/>
+        </w:rPr>
+        <w:t>a Ley 789 de 2002, lo define como:</w:t>
       </w:r>
     </w:p>
     <w:p>
@@ -4272,7 +4498,19 @@
           <w:lang w:eastAsia="es-CO"/>
         </w:rPr>
         <w:lastRenderedPageBreak/>
-        <w:t>pobreza, violencia, desempleo, desastres naturales, entre otros, este enfoque se basa en tres tipos de sistemas:</w:t>
+        <w:t>pobreza, violencia, desempleo, desastres naturales, entre otros</w:t>
+      </w:r>
+      <w:r>
+        <w:rPr>
+          <w:lang w:eastAsia="es-CO"/>
+        </w:rPr>
+        <w:t>. E</w:t>
+      </w:r>
+      <w:r>
+        <w:rPr>
+          <w:lang w:eastAsia="es-CO"/>
+        </w:rPr>
+        <w:t>ste enfoque se basa en tres tipos de sistemas:</w:t>
       </w:r>
     </w:p>
     <w:p>
@@ -5043,12 +5281,12 @@
       <w:pPr>
         <w:pStyle w:val="Ttulo1"/>
       </w:pPr>
-      <w:bookmarkStart w:id="7" w:name="_Toc201657223"/>
+      <w:bookmarkStart w:id="8" w:name="_Toc204004106"/>
       <w:r>
         <w:lastRenderedPageBreak/>
         <w:t>Educación y promoción de la salud</w:t>
       </w:r>
-      <w:bookmarkEnd w:id="7"/>
+      <w:bookmarkEnd w:id="8"/>
     </w:p>
     <w:p>
       <w:pPr>
@@ -5580,30 +5818,44 @@
           <w14:ligatures w14:val="none"/>
         </w:rPr>
       </w:pPr>
-      <w:bookmarkStart w:id="8" w:name="_Toc201657224"/>
-      <w:bookmarkEnd w:id="8"/>
+      <w:bookmarkStart w:id="9" w:name="_Toc201657224"/>
+      <w:bookmarkStart w:id="10" w:name="_Toc204004107"/>
+      <w:bookmarkEnd w:id="9"/>
+      <w:bookmarkEnd w:id="10"/>
     </w:p>
     <w:p>
       <w:pPr>
         <w:pStyle w:val="Ttulo2"/>
       </w:pPr>
-      <w:bookmarkStart w:id="9" w:name="_Toc201657225"/>
+      <w:bookmarkStart w:id="11" w:name="_Toc204004108"/>
       <w:r>
         <w:t>Marco normativo de la promoción de la salud en Colombia</w:t>
       </w:r>
-      <w:bookmarkEnd w:id="9"/>
-    </w:p>
-    <w:p>
-      <w:pPr>
-        <w:rPr>
-          <w:lang w:eastAsia="es-CO"/>
-        </w:rPr>
-      </w:pPr>
-      <w:r>
-        <w:rPr>
-          <w:lang w:eastAsia="es-CO"/>
-        </w:rPr>
-        <w:t>La constitución política de Colombia de 1991, en su artículo 49, establece por primera vez el derecho fundamental a la salud, definiendo responsabilidades claras para el estado y garantizando el acceso equitativo a los servicios de salud para toda la población. Este artículo señala que:</w:t>
+      <w:bookmarkEnd w:id="11"/>
+    </w:p>
+    <w:p>
+      <w:pPr>
+        <w:rPr>
+          <w:lang w:eastAsia="es-CO"/>
+        </w:rPr>
+      </w:pPr>
+      <w:r>
+        <w:rPr>
+          <w:lang w:eastAsia="es-CO"/>
+        </w:rPr>
+        <w:t xml:space="preserve">La </w:t>
+      </w:r>
+      <w:r>
+        <w:rPr>
+          <w:lang w:eastAsia="es-CO"/>
+        </w:rPr>
+        <w:t xml:space="preserve">Constitución Política </w:t>
+      </w:r>
+      <w:r>
+        <w:rPr>
+          <w:lang w:eastAsia="es-CO"/>
+        </w:rPr>
+        <w:t>de Colombia de 1991, en su artículo 49, establece por primera vez el derecho fundamental a la salud, definiendo responsabilidades claras para el estado y garantizando el acceso equitativo a los servicios de salud para toda la población. Este artículo señala que:</w:t>
       </w:r>
     </w:p>
     <w:p>
@@ -5697,7 +5949,19 @@
         <w:rPr>
           <w:lang w:val="es-419" w:eastAsia="es-CO"/>
         </w:rPr>
-        <w:t>Además de la constitución, Colombia ha desarrollado un conjunto de leyes, decretos, resoluciones y políticas públicas que fortalecen el derecho a la salud y promueven la creación de entornos saludables. A continuación, se destacan algunos instrumentos normativos relevantes:</w:t>
+        <w:t xml:space="preserve">Además de la </w:t>
+      </w:r>
+      <w:r>
+        <w:rPr>
+          <w:lang w:val="es-419" w:eastAsia="es-CO"/>
+        </w:rPr>
+        <w:t>Constitución</w:t>
+      </w:r>
+      <w:r>
+        <w:rPr>
+          <w:lang w:val="es-419" w:eastAsia="es-CO"/>
+        </w:rPr>
+        <w:t>, Colombia ha desarrollado un conjunto de leyes, decretos, resoluciones y políticas públicas que fortalecen el derecho a la salud y promueven la creación de entornos saludables. A continuación, se destacan algunos instrumentos normativos relevantes:</w:t>
       </w:r>
     </w:p>
     <w:p>
@@ -6766,11 +7030,11 @@
       <w:pPr>
         <w:pStyle w:val="Ttulo2"/>
       </w:pPr>
-      <w:bookmarkStart w:id="10" w:name="_Toc201657226"/>
+      <w:bookmarkStart w:id="12" w:name="_Toc204004109"/>
       <w:r>
         <w:t>Modelo de promoción de la salud</w:t>
       </w:r>
-      <w:bookmarkEnd w:id="10"/>
+      <w:bookmarkEnd w:id="12"/>
     </w:p>
     <w:p>
       <w:pPr>
@@ -6911,7 +7175,7 @@
           <w:bCs/>
           <w:lang w:eastAsia="es-CO"/>
         </w:rPr>
-        <w:t>Cogniciones y afectos relacionados con la conducta específicas</w:t>
+        <w:t>Cogniciones y afectos relacionados con la conducta específica</w:t>
       </w:r>
     </w:p>
     <w:p>
@@ -7133,10 +7397,10 @@
           <w:lang w:val="es-419" w:eastAsia="es-CO"/>
         </w:rPr>
         <w:drawing>
-          <wp:inline distT="0" distB="0" distL="0" distR="0" wp14:anchorId="0B643625" wp14:editId="4D869CB0">
+          <wp:inline distT="0" distB="0" distL="0" distR="0" wp14:anchorId="0B643625" wp14:editId="4D355C7A">
             <wp:extent cx="5534746" cy="3514294"/>
             <wp:effectExtent l="0" t="0" r="8890" b="0"/>
-            <wp:docPr id="7" name="Imagen 7" descr="Modelo de promoción de la salud según Pender explica cómo las personas adoptan conductas saludables. Se basa en factores individuales (experiencias previas y características personales), percepciones (beneficios, barreras, autoeficacia e influencias externas) y compromiso con la acción, lo que finalmente lleva a una conducta promotora de la salud."/>
+            <wp:docPr id="7" name="Imagen 7" descr="Modelo de promoción de la salud según Pender. Explica cómo las personas adoptan conductas saludables. Se basa en factores individuales (experiencias previas y características personales), percepciones (beneficios, barreras, autoeficacia e influencias externas) y compromiso con la acción, lo que finalmente lleva a una conducta promotora de la salud."/>
             <wp:cNvGraphicFramePr>
               <a:graphicFrameLocks xmlns:a="http://schemas.openxmlformats.org/drawingml/2006/main" noChangeAspect="1"/>
             </wp:cNvGraphicFramePr>
@@ -7144,7 +7408,7 @@
               <a:graphicData uri="http://schemas.openxmlformats.org/drawingml/2006/picture">
                 <pic:pic xmlns:pic="http://schemas.openxmlformats.org/drawingml/2006/picture">
                   <pic:nvPicPr>
-                    <pic:cNvPr id="7" name="Imagen 7" descr="Modelo de promoción de la salud según Pender explica cómo las personas adoptan conductas saludables. Se basa en factores individuales (experiencias previas y características personales), percepciones (beneficios, barreras, autoeficacia e influencias externas) y compromiso con la acción, lo que finalmente lleva a una conducta promotora de la salud."/>
+                    <pic:cNvPr id="7" name="Imagen 7" descr="Modelo de promoción de la salud según Pender. Explica cómo las personas adoptan conductas saludables. Se basa en factores individuales (experiencias previas y características personales), percepciones (beneficios, barreras, autoeficacia e influencias externas) y compromiso con la acción, lo que finalmente lleva a una conducta promotora de la salud."/>
                     <pic:cNvPicPr>
                       <a:picLocks noChangeAspect="1" noChangeArrowheads="1"/>
                     </pic:cNvPicPr>
@@ -7621,20 +7885,14 @@
     <w:p>
       <w:pPr>
         <w:rPr>
-          <w:lang w:val="es-419" w:eastAsia="es-CO"/>
-        </w:rPr>
-      </w:pPr>
-    </w:p>
-    <w:p>
-      <w:pPr>
-        <w:rPr>
-          <w:lang w:eastAsia="es-CO"/>
-        </w:rPr>
-      </w:pPr>
-      <w:r>
-        <w:rPr>
-          <w:lang w:eastAsia="es-CO"/>
-        </w:rPr>
+          <w:lang w:eastAsia="es-CO"/>
+        </w:rPr>
+      </w:pPr>
+      <w:r>
+        <w:rPr>
+          <w:lang w:eastAsia="es-CO"/>
+        </w:rPr>
+        <w:lastRenderedPageBreak/>
         <w:t>Por ello, las intervenciones en promoción de la salud deben estar diseñadas teniendo en cuenta la diversidad de factores individuales y sociales, y no enfocarse únicamente en dar información, sino también en fortalecer las capacidades y motivaciones de las personas para actuar.</w:t>
       </w:r>
     </w:p>
@@ -7769,12 +8027,12 @@
       <w:pPr>
         <w:pStyle w:val="Ttulo1"/>
       </w:pPr>
-      <w:bookmarkStart w:id="11" w:name="_Toc201657227"/>
+      <w:bookmarkStart w:id="13" w:name="_Toc204004110"/>
       <w:r>
         <w:lastRenderedPageBreak/>
         <w:t>Estrategia de Atención Integrada a las Enfermedades Prevalentes de la Infancia (AIEPI)</w:t>
       </w:r>
-      <w:bookmarkEnd w:id="11"/>
+      <w:bookmarkEnd w:id="13"/>
     </w:p>
     <w:p>
       <w:pPr>
@@ -8628,12 +8886,12 @@
       <w:pPr>
         <w:pStyle w:val="Ttulo1"/>
       </w:pPr>
-      <w:bookmarkStart w:id="12" w:name="_Toc201657228"/>
+      <w:bookmarkStart w:id="14" w:name="_Toc204004111"/>
       <w:r>
         <w:lastRenderedPageBreak/>
         <w:t>Integración de la Estrategia de Entornos Saludables (EES) y la estrategia AIEPI</w:t>
       </w:r>
-      <w:bookmarkEnd w:id="12"/>
+      <w:bookmarkEnd w:id="14"/>
     </w:p>
     <w:p>
       <w:pPr>
@@ -9041,7 +9299,55 @@
         <w:rPr>
           <w:lang w:eastAsia="es-CO"/>
         </w:rPr>
-        <w:t>Estas prácticas están orientadas a garantizar una nutrición adecuada y un desarrollo integral en los niños, a continuación de describen las siguientes.</w:t>
+        <w:t>Estas prácticas están orientadas a garantizar una nutrición adecuada y un desarrollo integral en los niños</w:t>
+      </w:r>
+      <w:r>
+        <w:rPr>
+          <w:lang w:eastAsia="es-CO"/>
+        </w:rPr>
+        <w:t>.</w:t>
+      </w:r>
+      <w:r>
+        <w:rPr>
+          <w:lang w:eastAsia="es-CO"/>
+        </w:rPr>
+        <w:t xml:space="preserve"> </w:t>
+      </w:r>
+      <w:r>
+        <w:rPr>
+          <w:lang w:eastAsia="es-CO"/>
+        </w:rPr>
+        <w:t>A</w:t>
+      </w:r>
+      <w:r>
+        <w:rPr>
+          <w:lang w:eastAsia="es-CO"/>
+        </w:rPr>
+        <w:t xml:space="preserve"> </w:t>
+      </w:r>
+      <w:r>
+        <w:rPr>
+          <w:lang w:eastAsia="es-CO"/>
+        </w:rPr>
+        <w:t>continuación,</w:t>
+      </w:r>
+      <w:r>
+        <w:rPr>
+          <w:lang w:eastAsia="es-CO"/>
+        </w:rPr>
+        <w:t xml:space="preserve"> </w:t>
+      </w:r>
+      <w:r>
+        <w:rPr>
+          <w:lang w:eastAsia="es-CO"/>
+        </w:rPr>
+        <w:t>s</w:t>
+      </w:r>
+      <w:r>
+        <w:rPr>
+          <w:lang w:eastAsia="es-CO"/>
+        </w:rPr>
+        <w:t>e describen las siguientes.</w:t>
       </w:r>
     </w:p>
     <w:p>
@@ -9585,12 +9891,12 @@
         </w:numPr>
         <w:ind w:left="1068"/>
       </w:pPr>
-      <w:bookmarkStart w:id="13" w:name="_Toc201657229"/>
+      <w:bookmarkStart w:id="15" w:name="_Toc204004112"/>
       <w:r>
         <w:lastRenderedPageBreak/>
         <w:t>Síntesis</w:t>
       </w:r>
-      <w:bookmarkEnd w:id="13"/>
+      <w:bookmarkEnd w:id="15"/>
     </w:p>
     <w:p>
       <w:pPr>
@@ -9607,21 +9913,21 @@
     </w:p>
     <w:p>
       <w:pPr>
-        <w:ind w:firstLine="0"/>
-        <w:rPr>
-          <w:lang w:val="es-419" w:eastAsia="es-CO"/>
+        <w:ind w:firstLine="284"/>
+        <w:rPr>
+          <w:lang w:eastAsia="es-CO"/>
         </w:rPr>
       </w:pPr>
       <w:r>
         <w:rPr>
           <w:noProof/>
-          <w:lang w:val="es-419" w:eastAsia="es-CO"/>
+          <w:lang w:eastAsia="es-CO"/>
         </w:rPr>
         <w:drawing>
-          <wp:inline distT="0" distB="0" distL="0" distR="0" wp14:anchorId="73612F23" wp14:editId="4F16E018">
-            <wp:extent cx="5829300" cy="2950522"/>
+          <wp:inline distT="0" distB="0" distL="0" distR="0" wp14:anchorId="2E6E2E8B" wp14:editId="6C709B25">
+            <wp:extent cx="6120752" cy="3098042"/>
             <wp:effectExtent l="0" t="0" r="0" b="0"/>
-            <wp:docPr id="15" name="Imagen 15" descr="Diagrama sobre la integración EES-AIEPI en gestión local, abordando desarrollo humano, políticas saludables, educación, estrategia AIEPI e integración comunitaria."/>
+            <wp:docPr id="2" name="Imagen 2" descr="Diagrama sobre la integración EES-AIEPI en gestión local, abordando desarrollo humano, políticas saludables, educación, estrategia AIEPI e integración comunitaria."/>
             <wp:cNvGraphicFramePr>
               <a:graphicFrameLocks xmlns:a="http://schemas.openxmlformats.org/drawingml/2006/main" noChangeAspect="1"/>
             </wp:cNvGraphicFramePr>
@@ -9629,7 +9935,7 @@
               <a:graphicData uri="http://schemas.openxmlformats.org/drawingml/2006/picture">
                 <pic:pic xmlns:pic="http://schemas.openxmlformats.org/drawingml/2006/picture">
                   <pic:nvPicPr>
-                    <pic:cNvPr id="15" name="Imagen 15" descr="Diagrama sobre la integración EES-AIEPI en gestión local, abordando desarrollo humano, políticas saludables, educación, estrategia AIEPI e integración comunitaria."/>
+                    <pic:cNvPr id="2" name="Imagen 2" descr="Diagrama sobre la integración EES-AIEPI en gestión local, abordando desarrollo humano, políticas saludables, educación, estrategia AIEPI e integración comunitaria."/>
                     <pic:cNvPicPr>
                       <a:picLocks noChangeAspect="1" noChangeArrowheads="1"/>
                     </pic:cNvPicPr>
@@ -9650,7 +9956,7 @@
                   <pic:spPr bwMode="auto">
                     <a:xfrm>
                       <a:off x="0" y="0"/>
-                      <a:ext cx="5837249" cy="2954545"/>
+                      <a:ext cx="6137763" cy="3106652"/>
                     </a:xfrm>
                     <a:prstGeom prst="rect">
                       <a:avLst/>
@@ -9713,12 +10019,12 @@
         </w:numPr>
         <w:ind w:left="1068"/>
       </w:pPr>
-      <w:bookmarkStart w:id="14" w:name="_Toc201657230"/>
+      <w:bookmarkStart w:id="16" w:name="_Toc204004113"/>
       <w:r>
         <w:lastRenderedPageBreak/>
         <w:t>Material complementario</w:t>
       </w:r>
-      <w:bookmarkEnd w:id="14"/>
+      <w:bookmarkEnd w:id="16"/>
     </w:p>
     <w:tbl>
       <w:tblPr>
@@ -9817,7 +10123,7 @@
               <w:pStyle w:val="TextoTablas"/>
             </w:pPr>
             <w:r>
-              <w:t>Ministerio de Salud y Protección Social. (s.f.). Lineamientos nacionales para la aplicación y el desarrollo de las EES. Ministerio de salud y protección social de Colombia.</w:t>
+              <w:t>Ministerio de Salud y Protección Social. (s.f.). Lineamientos nacionales para la aplicación y el desarrollo de las EES. Ministerio de Salud y Protección Social de Colombia.</w:t>
             </w:r>
           </w:p>
         </w:tc>
@@ -9963,14 +10269,9 @@
             <w:pPr>
               <w:pStyle w:val="TextoTablas"/>
             </w:pPr>
-            <w:hyperlink r:id="rId21" w:history="1">
-              <w:r>
-                <w:rPr>
-                  <w:rStyle w:val="Hipervnculo"/>
-                </w:rPr>
-                <w:t>https://ecoredsena-santander.github.io/41730034_CF3_IMPLEMENTACION_DE_ACCIONES_EDUCATIVAS/downloads/Determinantes_Sociodemograficos.pdf</w:t>
-              </w:r>
-            </w:hyperlink>
+            <w:r>
+              <w:t>Carpeta de anexos</w:t>
+            </w:r>
           </w:p>
         </w:tc>
       </w:tr>
@@ -10022,7 +10323,7 @@
             <w:pPr>
               <w:pStyle w:val="TextoTablas"/>
             </w:pPr>
-            <w:hyperlink r:id="rId22" w:history="1">
+            <w:hyperlink r:id="rId21" w:history="1">
               <w:r>
                 <w:rPr>
                   <w:rStyle w:val="Hipervnculo"/>
@@ -10067,12 +10368,12 @@
         </w:numPr>
         <w:ind w:left="1068"/>
       </w:pPr>
-      <w:bookmarkStart w:id="15" w:name="_Toc201657231"/>
+      <w:bookmarkStart w:id="17" w:name="_Toc204004114"/>
       <w:r>
         <w:lastRenderedPageBreak/>
         <w:t>Glosario</w:t>
       </w:r>
-      <w:bookmarkEnd w:id="15"/>
+      <w:bookmarkEnd w:id="17"/>
     </w:p>
     <w:p>
       <w:pPr>
@@ -10097,7 +10398,7 @@
           <w:bdr w:val="none" w:sz="0" w:space="0" w:color="auto" w:frame="1"/>
           <w:lang w:eastAsia="es-CO"/>
         </w:rPr>
-        <w:t>Atención Integral a la Infancia.</w:t>
+        <w:t>estrategia que mejora la atención y prevención de enfermedades en niños menores de cinco años, ayudando a reducir su enfermedad y mortalidad.</w:t>
       </w:r>
     </w:p>
     <w:p>
@@ -10181,308 +10482,300 @@
     <w:p>
       <w:pPr>
         <w:rPr>
+          <w:bdr w:val="none" w:sz="0" w:space="0" w:color="auto" w:frame="1"/>
+          <w:lang w:eastAsia="es-CO"/>
+        </w:rPr>
+      </w:pPr>
+      <w:r>
+        <w:rPr>
           <w:b/>
           <w:bCs/>
           <w:bdr w:val="none" w:sz="0" w:space="0" w:color="auto" w:frame="1"/>
           <w:lang w:eastAsia="es-CO"/>
         </w:rPr>
-      </w:pPr>
-      <w:r>
+        <w:t>EES: </w:t>
+      </w:r>
+      <w:r>
+        <w:rPr>
+          <w:bdr w:val="none" w:sz="0" w:space="0" w:color="auto" w:frame="1"/>
+          <w:lang w:eastAsia="es-CO"/>
+        </w:rPr>
+        <w:t>estrategias de Entornos Saludables que promueven acciones intersectoriales para mejorar la salud a través de la creación de espacios seguros, saludables y sostenibles en la escuela, el hogar, el trabajo y la comunidad.</w:t>
+      </w:r>
+    </w:p>
+    <w:p>
+      <w:pPr>
         <w:rPr>
           <w:b/>
           <w:bCs/>
           <w:bdr w:val="none" w:sz="0" w:space="0" w:color="auto" w:frame="1"/>
           <w:lang w:eastAsia="es-CO"/>
         </w:rPr>
-        <w:t>EES: </w:t>
-      </w:r>
-      <w:r>
-        <w:rPr>
-          <w:bdr w:val="none" w:sz="0" w:space="0" w:color="auto" w:frame="1"/>
-          <w:lang w:eastAsia="es-CO"/>
-        </w:rPr>
-        <w:t>crear espacios físicos y sociales saludables.</w:t>
-      </w:r>
-    </w:p>
-    <w:p>
-      <w:pPr>
+      </w:pPr>
+      <w:r>
         <w:rPr>
           <w:b/>
           <w:bCs/>
           <w:bdr w:val="none" w:sz="0" w:space="0" w:color="auto" w:frame="1"/>
           <w:lang w:eastAsia="es-CO"/>
         </w:rPr>
-      </w:pPr>
-      <w:r>
+        <w:t>Entorno: </w:t>
+      </w:r>
+      <w:r>
+        <w:rPr>
+          <w:bdr w:val="none" w:sz="0" w:space="0" w:color="auto" w:frame="1"/>
+          <w:lang w:eastAsia="es-CO"/>
+        </w:rPr>
+        <w:t>espacio donde vivimos y convivimos.</w:t>
+      </w:r>
+    </w:p>
+    <w:p>
+      <w:pPr>
         <w:rPr>
           <w:b/>
           <w:bCs/>
           <w:bdr w:val="none" w:sz="0" w:space="0" w:color="auto" w:frame="1"/>
           <w:lang w:eastAsia="es-CO"/>
         </w:rPr>
-        <w:t>Entorno: </w:t>
-      </w:r>
-      <w:r>
-        <w:rPr>
-          <w:bdr w:val="none" w:sz="0" w:space="0" w:color="auto" w:frame="1"/>
-          <w:lang w:eastAsia="es-CO"/>
-        </w:rPr>
-        <w:t>espacio donde vivimos y convivimos.</w:t>
-      </w:r>
-    </w:p>
-    <w:p>
-      <w:pPr>
+      </w:pPr>
+      <w:r>
         <w:rPr>
           <w:b/>
           <w:bCs/>
           <w:bdr w:val="none" w:sz="0" w:space="0" w:color="auto" w:frame="1"/>
           <w:lang w:eastAsia="es-CO"/>
         </w:rPr>
-      </w:pPr>
-      <w:r>
+        <w:t>Familia: </w:t>
+      </w:r>
+      <w:r>
+        <w:rPr>
+          <w:bdr w:val="none" w:sz="0" w:space="0" w:color="auto" w:frame="1"/>
+          <w:lang w:eastAsia="es-CO"/>
+        </w:rPr>
+        <w:t>núcleo básico de apoyo social.</w:t>
+      </w:r>
+    </w:p>
+    <w:p>
+      <w:pPr>
         <w:rPr>
           <w:b/>
           <w:bCs/>
           <w:bdr w:val="none" w:sz="0" w:space="0" w:color="auto" w:frame="1"/>
           <w:lang w:eastAsia="es-CO"/>
         </w:rPr>
-        <w:t>Familia: </w:t>
-      </w:r>
-      <w:r>
-        <w:rPr>
-          <w:bdr w:val="none" w:sz="0" w:space="0" w:color="auto" w:frame="1"/>
-          <w:lang w:eastAsia="es-CO"/>
-        </w:rPr>
-        <w:t>núcleo básico de apoyo social.</w:t>
-      </w:r>
-    </w:p>
-    <w:p>
-      <w:pPr>
+      </w:pPr>
+      <w:r>
         <w:rPr>
           <w:b/>
           <w:bCs/>
           <w:bdr w:val="none" w:sz="0" w:space="0" w:color="auto" w:frame="1"/>
           <w:lang w:eastAsia="es-CO"/>
         </w:rPr>
-      </w:pPr>
-      <w:r>
+        <w:t>Hábitos: </w:t>
+      </w:r>
+      <w:r>
+        <w:rPr>
+          <w:bdr w:val="none" w:sz="0" w:space="0" w:color="auto" w:frame="1"/>
+          <w:lang w:eastAsia="es-CO"/>
+        </w:rPr>
+        <w:t>comportamientos adquiridos diariamente.</w:t>
+      </w:r>
+    </w:p>
+    <w:p>
+      <w:pPr>
         <w:rPr>
           <w:b/>
           <w:bCs/>
           <w:bdr w:val="none" w:sz="0" w:space="0" w:color="auto" w:frame="1"/>
           <w:lang w:eastAsia="es-CO"/>
         </w:rPr>
-        <w:t>Hábitos: </w:t>
-      </w:r>
-      <w:r>
-        <w:rPr>
-          <w:bdr w:val="none" w:sz="0" w:space="0" w:color="auto" w:frame="1"/>
-          <w:lang w:eastAsia="es-CO"/>
-        </w:rPr>
-        <w:t>comportamientos adquiridos diariamente.</w:t>
-      </w:r>
-    </w:p>
-    <w:p>
-      <w:pPr>
+      </w:pPr>
+      <w:r>
         <w:rPr>
           <w:b/>
           <w:bCs/>
           <w:bdr w:val="none" w:sz="0" w:space="0" w:color="auto" w:frame="1"/>
           <w:lang w:eastAsia="es-CO"/>
         </w:rPr>
-      </w:pPr>
-      <w:r>
+        <w:t>Niñez: </w:t>
+      </w:r>
+      <w:r>
+        <w:rPr>
+          <w:bdr w:val="none" w:sz="0" w:space="0" w:color="auto" w:frame="1"/>
+          <w:lang w:eastAsia="es-CO"/>
+        </w:rPr>
+        <w:t>etapa temprana de la vida.</w:t>
+      </w:r>
+    </w:p>
+    <w:p>
+      <w:pPr>
         <w:rPr>
           <w:b/>
           <w:bCs/>
           <w:bdr w:val="none" w:sz="0" w:space="0" w:color="auto" w:frame="1"/>
           <w:lang w:eastAsia="es-CO"/>
         </w:rPr>
-        <w:t>Niñez: </w:t>
-      </w:r>
-      <w:r>
-        <w:rPr>
-          <w:bdr w:val="none" w:sz="0" w:space="0" w:color="auto" w:frame="1"/>
-          <w:lang w:eastAsia="es-CO"/>
-        </w:rPr>
-        <w:t>etapa temprana de la vida.</w:t>
-      </w:r>
-    </w:p>
-    <w:p>
-      <w:pPr>
+      </w:pPr>
+      <w:r>
         <w:rPr>
           <w:b/>
           <w:bCs/>
           <w:bdr w:val="none" w:sz="0" w:space="0" w:color="auto" w:frame="1"/>
           <w:lang w:eastAsia="es-CO"/>
         </w:rPr>
-      </w:pPr>
-      <w:r>
+        <w:t>Participación: </w:t>
+      </w:r>
+      <w:r>
+        <w:rPr>
+          <w:bdr w:val="none" w:sz="0" w:space="0" w:color="auto" w:frame="1"/>
+          <w:lang w:eastAsia="es-CO"/>
+        </w:rPr>
+        <w:t>involucrarse en acciones de salud.</w:t>
+      </w:r>
+    </w:p>
+    <w:p>
+      <w:pPr>
         <w:rPr>
           <w:b/>
           <w:bCs/>
           <w:bdr w:val="none" w:sz="0" w:space="0" w:color="auto" w:frame="1"/>
           <w:lang w:eastAsia="es-CO"/>
         </w:rPr>
-        <w:t>Participación: </w:t>
-      </w:r>
-      <w:r>
-        <w:rPr>
-          <w:bdr w:val="none" w:sz="0" w:space="0" w:color="auto" w:frame="1"/>
-          <w:lang w:eastAsia="es-CO"/>
-        </w:rPr>
-        <w:t>involucrarse en acciones de salud.</w:t>
-      </w:r>
-    </w:p>
-    <w:p>
-      <w:pPr>
+      </w:pPr>
+      <w:r>
         <w:rPr>
           <w:b/>
           <w:bCs/>
           <w:bdr w:val="none" w:sz="0" w:space="0" w:color="auto" w:frame="1"/>
           <w:lang w:eastAsia="es-CO"/>
         </w:rPr>
-      </w:pPr>
-      <w:r>
+        <w:t>Prevención: </w:t>
+      </w:r>
+      <w:r>
+        <w:rPr>
+          <w:bdr w:val="none" w:sz="0" w:space="0" w:color="auto" w:frame="1"/>
+          <w:lang w:eastAsia="es-CO"/>
+        </w:rPr>
+        <w:t>evitar aparición de enfermedades.</w:t>
+      </w:r>
+    </w:p>
+    <w:p>
+      <w:pPr>
         <w:rPr>
           <w:b/>
           <w:bCs/>
           <w:bdr w:val="none" w:sz="0" w:space="0" w:color="auto" w:frame="1"/>
           <w:lang w:eastAsia="es-CO"/>
         </w:rPr>
-        <w:t>Prevención: </w:t>
-      </w:r>
-      <w:r>
-        <w:rPr>
-          <w:bdr w:val="none" w:sz="0" w:space="0" w:color="auto" w:frame="1"/>
-          <w:lang w:eastAsia="es-CO"/>
-        </w:rPr>
-        <w:t>evitar aparición de enfermedades.</w:t>
-      </w:r>
-    </w:p>
-    <w:p>
-      <w:pPr>
+      </w:pPr>
+      <w:r>
         <w:rPr>
           <w:b/>
           <w:bCs/>
           <w:bdr w:val="none" w:sz="0" w:space="0" w:color="auto" w:frame="1"/>
           <w:lang w:eastAsia="es-CO"/>
         </w:rPr>
-      </w:pPr>
-      <w:r>
+        <w:t>Promoción: </w:t>
+      </w:r>
+      <w:r>
+        <w:rPr>
+          <w:bdr w:val="none" w:sz="0" w:space="0" w:color="auto" w:frame="1"/>
+          <w:lang w:eastAsia="es-CO"/>
+        </w:rPr>
+        <w:t xml:space="preserve">fomentar capacidades para cuidar </w:t>
+      </w:r>
+      <w:r>
+        <w:rPr>
+          <w:bdr w:val="none" w:sz="0" w:space="0" w:color="auto" w:frame="1"/>
+          <w:lang w:eastAsia="es-CO"/>
+        </w:rPr>
+        <w:t xml:space="preserve">la </w:t>
+      </w:r>
+      <w:r>
+        <w:rPr>
+          <w:bdr w:val="none" w:sz="0" w:space="0" w:color="auto" w:frame="1"/>
+          <w:lang w:eastAsia="es-CO"/>
+        </w:rPr>
+        <w:t>salud.</w:t>
+      </w:r>
+    </w:p>
+    <w:p>
+      <w:pPr>
         <w:rPr>
           <w:b/>
           <w:bCs/>
           <w:bdr w:val="none" w:sz="0" w:space="0" w:color="auto" w:frame="1"/>
           <w:lang w:eastAsia="es-CO"/>
         </w:rPr>
-        <w:t>Promoción: </w:t>
-      </w:r>
-      <w:r>
-        <w:rPr>
-          <w:bdr w:val="none" w:sz="0" w:space="0" w:color="auto" w:frame="1"/>
-          <w:lang w:eastAsia="es-CO"/>
-        </w:rPr>
-        <w:t>fomentar capacidades para cuidar salud.</w:t>
-      </w:r>
-    </w:p>
-    <w:p>
-      <w:pPr>
+      </w:pPr>
+      <w:r>
         <w:rPr>
           <w:b/>
           <w:bCs/>
           <w:bdr w:val="none" w:sz="0" w:space="0" w:color="auto" w:frame="1"/>
           <w:lang w:eastAsia="es-CO"/>
         </w:rPr>
-      </w:pPr>
-      <w:r>
+        <w:t>Protección: </w:t>
+      </w:r>
+      <w:r>
+        <w:rPr>
+          <w:bdr w:val="none" w:sz="0" w:space="0" w:color="auto" w:frame="1"/>
+          <w:lang w:eastAsia="es-CO"/>
+        </w:rPr>
+        <w:t>acciones para evitar problemas de salud.</w:t>
+      </w:r>
+    </w:p>
+    <w:p>
+      <w:pPr>
         <w:rPr>
           <w:b/>
           <w:bCs/>
           <w:bdr w:val="none" w:sz="0" w:space="0" w:color="auto" w:frame="1"/>
           <w:lang w:eastAsia="es-CO"/>
         </w:rPr>
-        <w:t>Protección: </w:t>
-      </w:r>
-      <w:r>
-        <w:rPr>
-          <w:bdr w:val="none" w:sz="0" w:space="0" w:color="auto" w:frame="1"/>
-          <w:lang w:eastAsia="es-CO"/>
-        </w:rPr>
-        <w:t>acciones para evitar problemas de salud.</w:t>
-      </w:r>
-    </w:p>
-    <w:p>
-      <w:pPr>
+      </w:pPr>
+      <w:r>
         <w:rPr>
           <w:b/>
           <w:bCs/>
           <w:bdr w:val="none" w:sz="0" w:space="0" w:color="auto" w:frame="1"/>
           <w:lang w:eastAsia="es-CO"/>
         </w:rPr>
-      </w:pPr>
-      <w:r>
+        <w:t>Riesgo: </w:t>
+      </w:r>
+      <w:r>
+        <w:rPr>
+          <w:bdr w:val="none" w:sz="0" w:space="0" w:color="auto" w:frame="1"/>
+          <w:lang w:eastAsia="es-CO"/>
+        </w:rPr>
+        <w:t>probabilidad de daño o enfermedad.</w:t>
+      </w:r>
+    </w:p>
+    <w:p>
+      <w:pPr>
         <w:rPr>
           <w:b/>
           <w:bCs/>
           <w:bdr w:val="none" w:sz="0" w:space="0" w:color="auto" w:frame="1"/>
           <w:lang w:eastAsia="es-CO"/>
         </w:rPr>
-        <w:t>Riesgo: </w:t>
-      </w:r>
-      <w:r>
-        <w:rPr>
-          <w:bdr w:val="none" w:sz="0" w:space="0" w:color="auto" w:frame="1"/>
-          <w:lang w:eastAsia="es-CO"/>
-        </w:rPr>
-        <w:t>probabilidad de daño o enfermedad.</w:t>
-      </w:r>
-    </w:p>
-    <w:p>
-      <w:pPr>
+      </w:pPr>
+      <w:r>
         <w:rPr>
           <w:b/>
           <w:bCs/>
           <w:bdr w:val="none" w:sz="0" w:space="0" w:color="auto" w:frame="1"/>
           <w:lang w:eastAsia="es-CO"/>
         </w:rPr>
-      </w:pPr>
-      <w:r>
-        <w:rPr>
-          <w:b/>
-          <w:bCs/>
+        <w:t>Salud: </w:t>
+      </w:r>
+      <w:r>
+        <w:rPr>
           <w:bdr w:val="none" w:sz="0" w:space="0" w:color="auto" w:frame="1"/>
           <w:lang w:eastAsia="es-CO"/>
         </w:rPr>
-        <w:t>Salud: </w:t>
-      </w:r>
-      <w:r>
-        <w:rPr>
-          <w:bdr w:val="none" w:sz="0" w:space="0" w:color="auto" w:frame="1"/>
-          <w:lang w:eastAsia="es-CO"/>
-        </w:rPr>
         <w:t>bienestar físico, mental y social.</w:t>
       </w:r>
-    </w:p>
-    <w:p>
-      <w:pPr>
-        <w:ind w:firstLine="0"/>
-        <w:rPr>
-          <w:szCs w:val="28"/>
-          <w:bdr w:val="none" w:sz="0" w:space="0" w:color="auto" w:frame="1"/>
-          <w:lang w:eastAsia="es-CO"/>
-        </w:rPr>
-      </w:pPr>
-    </w:p>
-    <w:p>
-      <w:pPr>
-        <w:ind w:firstLine="0"/>
-        <w:rPr>
-          <w:szCs w:val="28"/>
-          <w:bdr w:val="none" w:sz="0" w:space="0" w:color="auto" w:frame="1"/>
-          <w:lang w:eastAsia="es-CO"/>
-        </w:rPr>
-      </w:pPr>
     </w:p>
     <w:p>
       <w:pPr>
@@ -10503,7 +10796,7 @@
         </w:numPr>
         <w:ind w:left="1068"/>
       </w:pPr>
-      <w:bookmarkStart w:id="16" w:name="_Toc201657232"/>
+      <w:bookmarkStart w:id="18" w:name="_Toc204004115"/>
       <w:r>
         <w:rPr>
           <w:bdr w:val="none" w:sz="0" w:space="0" w:color="auto" w:frame="1"/>
@@ -10511,7 +10804,7 @@
         <w:lastRenderedPageBreak/>
         <w:t>Referencias bibliográficas</w:t>
       </w:r>
-      <w:bookmarkEnd w:id="16"/>
+      <w:bookmarkEnd w:id="18"/>
     </w:p>
     <w:p>
       <w:pPr>
@@ -10534,20 +10827,9 @@
           <w:lang w:eastAsia="es-CO"/>
           <w14:ligatures w14:val="none"/>
         </w:rPr>
-        <w:t>Constitución Política de Colombia. (1991). Artículo 49 – Atención en salud y saneamiento ambiental. Constitución Política de Colombia. Recuperado de</w:t>
-      </w:r>
-      <w:r>
-        <w:rPr>
-          <w:rFonts w:eastAsia="Times New Roman" w:cstheme="minorHAnsi"/>
-          <w:kern w:val="0"/>
-          <w:szCs w:val="28"/>
-          <w:bdr w:val="none" w:sz="0" w:space="0" w:color="auto" w:frame="1"/>
-          <w:lang w:eastAsia="es-CO"/>
-          <w14:ligatures w14:val="none"/>
-        </w:rPr>
-        <w:t xml:space="preserve"> </w:t>
-      </w:r>
-      <w:hyperlink r:id="rId23" w:history="1">
+        <w:t xml:space="preserve">Constitución Política de Colombia. (1991). Artículo 49 – Atención en salud y saneamiento ambiental. Constitución Política de Colombia. </w:t>
+      </w:r>
+      <w:hyperlink r:id="rId22" w:history="1">
         <w:r>
           <w:rPr>
             <w:rStyle w:val="Hipervnculo"/>
@@ -10583,20 +10865,9 @@
           <w:lang w:eastAsia="es-CO"/>
           <w14:ligatures w14:val="none"/>
         </w:rPr>
-        <w:t>Giraldo, A., Toro, M., Macías, A., Valencia, C., &amp; Palacio, S. (2010). La promoción de la salud como estrategia para el fomento de estilos de vida saludables. Hacia la promoción de la salud, 15(1), 128-143. Recuperado de</w:t>
-      </w:r>
-      <w:r>
-        <w:rPr>
-          <w:rFonts w:eastAsia="Times New Roman" w:cstheme="minorHAnsi"/>
-          <w:kern w:val="0"/>
-          <w:szCs w:val="28"/>
-          <w:bdr w:val="none" w:sz="0" w:space="0" w:color="auto" w:frame="1"/>
-          <w:lang w:eastAsia="es-CO"/>
-          <w14:ligatures w14:val="none"/>
-        </w:rPr>
-        <w:t xml:space="preserve"> </w:t>
-      </w:r>
-      <w:hyperlink r:id="rId24" w:history="1">
+        <w:t xml:space="preserve">Giraldo, A., Toro, M., Macías, A., Valencia, C., &amp; Palacio, S. (2010). La promoción de la salud como estrategia para el fomento de estilos de vida saludables. Hacia la promoción de la salud, 15(1), 128-143. </w:t>
+      </w:r>
+      <w:hyperlink r:id="rId23" w:history="1">
         <w:r>
           <w:rPr>
             <w:rStyle w:val="Hipervnculo"/>
@@ -10645,7 +10916,7 @@
         </w:rPr>
         <w:t xml:space="preserve"> </w:t>
       </w:r>
-      <w:hyperlink r:id="rId25" w:history="1">
+      <w:hyperlink r:id="rId24" w:history="1">
         <w:r>
           <w:rPr>
             <w:rStyle w:val="Hipervnculo"/>
@@ -10729,12 +11000,12 @@
         </w:numPr>
         <w:ind w:left="708"/>
       </w:pPr>
-      <w:bookmarkStart w:id="17" w:name="_Toc201657233"/>
+      <w:bookmarkStart w:id="19" w:name="_Toc204004116"/>
       <w:r>
         <w:lastRenderedPageBreak/>
         <w:t>Créditos</w:t>
       </w:r>
-      <w:bookmarkEnd w:id="17"/>
+      <w:bookmarkEnd w:id="19"/>
     </w:p>
     <w:tbl>
       <w:tblPr>
@@ -10861,6 +11132,14 @@
             <w:r>
               <w:t>Claudia Johana Gómez</w:t>
             </w:r>
+            <w:r>
+              <w:t xml:space="preserve"> </w:t>
+            </w:r>
+            <w:proofErr w:type="spellStart"/>
+            <w:r>
+              <w:t>Peréz</w:t>
+            </w:r>
+            <w:proofErr w:type="spellEnd"/>
           </w:p>
         </w:tc>
         <w:tc>
@@ -11261,8 +11540,8 @@
       </w:pPr>
     </w:p>
     <w:sectPr>
-      <w:headerReference w:type="default" r:id="rId26"/>
-      <w:footerReference w:type="default" r:id="rId27"/>
+      <w:headerReference w:type="default" r:id="rId25"/>
+      <w:footerReference w:type="default" r:id="rId26"/>
       <w:pgSz w:w="12240" w:h="15840"/>
       <w:pgMar w:top="1701" w:right="1134" w:bottom="1134" w:left="1134" w:header="709" w:footer="737" w:gutter="0"/>
       <w:pgNumType w:start="1"/>
@@ -11343,128 +11622,6 @@
           <w:pStyle w:val="Piedepgina"/>
           <w:jc w:val="right"/>
         </w:pPr>
-        <w:r>
-          <w:rPr>
-            <w:noProof/>
-            <w:lang w:eastAsia="es-CO"/>
-          </w:rPr>
-          <mc:AlternateContent>
-            <mc:Choice Requires="wps">
-              <w:drawing>
-                <wp:anchor distT="45720" distB="45720" distL="114300" distR="114300" simplePos="0" relativeHeight="251661312" behindDoc="0" locked="0" layoutInCell="1" allowOverlap="1" wp14:anchorId="797C42AF" wp14:editId="60C5BEAC">
-                  <wp:simplePos x="0" y="0"/>
-                  <wp:positionH relativeFrom="column">
-                    <wp:posOffset>204470</wp:posOffset>
-                  </wp:positionH>
-                  <wp:positionV relativeFrom="paragraph">
-                    <wp:posOffset>7970</wp:posOffset>
-                  </wp:positionV>
-                  <wp:extent cx="5780690" cy="525518"/>
-                  <wp:effectExtent l="0" t="0" r="0" b="8255"/>
-                  <wp:wrapNone/>
-                  <wp:docPr id="1215982720" name="Cuadro de texto 2">
-                    <a:extLst xmlns:a="http://schemas.openxmlformats.org/drawingml/2006/main">
-                      <a:ext uri="{C183D7F6-B498-43B3-948B-1728B52AA6E4}">
-                        <adec:decorative xmlns:adec="http://schemas.microsoft.com/office/drawing/2017/decorative" val="1"/>
-                      </a:ext>
-                    </a:extLst>
-                  </wp:docPr>
-                  <wp:cNvGraphicFramePr>
-                    <a:graphicFrameLocks xmlns:a="http://schemas.openxmlformats.org/drawingml/2006/main"/>
-                  </wp:cNvGraphicFramePr>
-                  <a:graphic xmlns:a="http://schemas.openxmlformats.org/drawingml/2006/main">
-                    <a:graphicData uri="http://schemas.microsoft.com/office/word/2010/wordprocessingShape">
-                      <wps:wsp>
-                        <wps:cNvSpPr txBox="1">
-                          <a:spLocks noChangeArrowheads="1"/>
-                        </wps:cNvSpPr>
-                        <wps:spPr bwMode="auto">
-                          <a:xfrm>
-                            <a:off x="0" y="0"/>
-                            <a:ext cx="5780690" cy="525518"/>
-                          </a:xfrm>
-                          <a:prstGeom prst="rect">
-                            <a:avLst/>
-                          </a:prstGeom>
-                          <a:solidFill>
-                            <a:srgbClr val="FFFFFF"/>
-                          </a:solidFill>
-                          <a:ln w="9525">
-                            <a:noFill/>
-                            <a:miter lim="800000"/>
-                            <a:headEnd/>
-                            <a:tailEnd/>
-                          </a:ln>
-                        </wps:spPr>
-                        <wps:txbx>
-                          <w:txbxContent>
-                            <w:p>
-                              <w:pPr>
-                                <w:spacing w:before="0"/>
-                                <w:jc w:val="center"/>
-                                <w:rPr>
-                                  <w:b/>
-                                  <w:bCs/>
-                                </w:rPr>
-                              </w:pPr>
-                              <w:r>
-                                <w:rPr>
-                                  <w:b/>
-                                  <w:bCs/>
-                                </w:rPr>
-                                <w:t>Grupo de Ejecución de la Formación Virtual</w:t>
-                              </w:r>
-                            </w:p>
-                          </w:txbxContent>
-                        </wps:txbx>
-                        <wps:bodyPr rot="0" vert="horz" wrap="square" lIns="91440" tIns="45720" rIns="91440" bIns="45720" anchor="t" anchorCtr="0">
-                          <a:noAutofit/>
-                        </wps:bodyPr>
-                      </wps:wsp>
-                    </a:graphicData>
-                  </a:graphic>
-                  <wp14:sizeRelH relativeFrom="margin">
-                    <wp14:pctWidth>0</wp14:pctWidth>
-                  </wp14:sizeRelH>
-                  <wp14:sizeRelV relativeFrom="margin">
-                    <wp14:pctHeight>0</wp14:pctHeight>
-                  </wp14:sizeRelV>
-                </wp:anchor>
-              </w:drawing>
-            </mc:Choice>
-            <mc:Fallback>
-              <w:pict>
-                <v:shapetype w14:anchorId="797C42AF" id="_x0000_t202" coordsize="21600,21600" o:spt="202" path="m,l,21600r21600,l21600,xe">
-                  <v:stroke joinstyle="miter"/>
-                  <v:path gradientshapeok="t" o:connecttype="rect"/>
-                </v:shapetype>
-                <v:shape id="_x0000_s1027" type="#_x0000_t202" alt="&quot;&quot;" style="position:absolute;left:0;text-align:left;margin-left:16.1pt;margin-top:.65pt;width:455.15pt;height:41.4pt;z-index:251661312;visibility:visible;mso-wrap-style:square;mso-width-percent:0;mso-height-percent:0;mso-wrap-distance-left:9pt;mso-wrap-distance-top:3.6pt;mso-wrap-distance-right:9pt;mso-wrap-distance-bottom:3.6pt;mso-position-horizontal:absolute;mso-position-horizontal-relative:text;mso-position-vertical:absolute;mso-position-vertical-relative:text;mso-width-percent:0;mso-height-percent:0;mso-width-relative:margin;mso-height-relative:margin;v-text-anchor:top" o:gfxdata="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" stroked="f">
-                  <v:textbox>
-                    <w:txbxContent>
-                      <w:p>
-                        <w:pPr>
-                          <w:spacing w:before="0"/>
-                          <w:jc w:val="center"/>
-                          <w:rPr>
-                            <w:b/>
-                            <w:bCs/>
-                          </w:rPr>
-                        </w:pPr>
-                        <w:r>
-                          <w:rPr>
-                            <w:b/>
-                            <w:bCs/>
-                          </w:rPr>
-                          <w:t>Grupo de Ejecución de la Formación Virtual</w:t>
-                        </w:r>
-                      </w:p>
-                    </w:txbxContent>
-                  </v:textbox>
-                </v:shape>
-              </w:pict>
-            </mc:Fallback>
-          </mc:AlternateContent>
-        </w:r>
         <w:r>
           <w:fldChar w:fldCharType="begin"/>
         </w:r>
@@ -11629,7 +11786,7 @@
         <v:path o:extrusionok="f" gradientshapeok="t" o:connecttype="rect"/>
         <o:lock v:ext="edit" aspectratio="t"/>
       </v:shapetype>
-      <v:shape id="_x0000_i1028" type="#_x0000_t75" style="width:11.15pt;height:11.15pt" o:bullet="t">
+      <v:shape id="_x0000_i1164" type="#_x0000_t75" style="width:12pt;height:12pt" o:bullet="t">
         <v:imagedata r:id="rId1" o:title="mso8C56"/>
       </v:shape>
     </w:pict>
@@ -18980,6 +19137,7 @@
   <w:style w:type="character" w:default="1" w:styleId="Fuentedeprrafopredeter">
     <w:name w:val="Default Paragraph Font"/>
     <w:uiPriority w:val="1"/>
+    <w:semiHidden/>
     <w:unhideWhenUsed/>
   </w:style>
   <w:style w:type="table" w:default="1" w:styleId="Tablanormal">
@@ -19865,6 +20023,74 @@
       </w:tcPr>
     </w:tblStylePr>
   </w:style>
+  <w:style w:type="character" w:styleId="Refdecomentario">
+    <w:name w:val="annotation reference"/>
+    <w:basedOn w:val="Fuentedeprrafopredeter"/>
+    <w:uiPriority w:val="99"/>
+    <w:semiHidden/>
+    <w:unhideWhenUsed/>
+    <w:rsid w:val="00815EE5"/>
+    <w:rPr>
+      <w:sz w:val="16"/>
+      <w:szCs w:val="16"/>
+    </w:rPr>
+  </w:style>
+  <w:style w:type="paragraph" w:styleId="Textocomentario">
+    <w:name w:val="annotation text"/>
+    <w:basedOn w:val="Normal"/>
+    <w:link w:val="TextocomentarioCar"/>
+    <w:uiPriority w:val="99"/>
+    <w:semiHidden/>
+    <w:unhideWhenUsed/>
+    <w:rsid w:val="00815EE5"/>
+    <w:pPr>
+      <w:spacing w:line="240" w:lineRule="auto"/>
+    </w:pPr>
+    <w:rPr>
+      <w:sz w:val="20"/>
+      <w:szCs w:val="20"/>
+    </w:rPr>
+  </w:style>
+  <w:style w:type="character" w:customStyle="1" w:styleId="TextocomentarioCar">
+    <w:name w:val="Texto comentario Car"/>
+    <w:basedOn w:val="Fuentedeprrafopredeter"/>
+    <w:link w:val="Textocomentario"/>
+    <w:uiPriority w:val="99"/>
+    <w:semiHidden/>
+    <w:rsid w:val="00815EE5"/>
+    <w:rPr>
+      <w:sz w:val="20"/>
+      <w:szCs w:val="20"/>
+    </w:rPr>
+  </w:style>
+  <w:style w:type="paragraph" w:styleId="Asuntodelcomentario">
+    <w:name w:val="annotation subject"/>
+    <w:basedOn w:val="Textocomentario"/>
+    <w:next w:val="Textocomentario"/>
+    <w:link w:val="AsuntodelcomentarioCar"/>
+    <w:uiPriority w:val="99"/>
+    <w:semiHidden/>
+    <w:unhideWhenUsed/>
+    <w:rsid w:val="00815EE5"/>
+    <w:rPr>
+      <w:b/>
+      <w:bCs/>
+    </w:rPr>
+  </w:style>
+  <w:style w:type="character" w:customStyle="1" w:styleId="AsuntodelcomentarioCar">
+    <w:name w:val="Asunto del comentario Car"/>
+    <w:basedOn w:val="TextocomentarioCar"/>
+    <w:link w:val="Asuntodelcomentario"/>
+    <w:uiPriority w:val="99"/>
+    <w:semiHidden/>
+    <w:rsid w:val="00815EE5"/>
+    <w:rPr>
+      <w:b/>
+      <w:bCs/>
+      <w:sz w:val="20"/>
+      <w:szCs w:val="20"/>
+    </w:rPr>
+  </w:style>
 </w:styles>
 </file>
 
@@ -20164,6 +20390,10 @@
 </file>
 
 <file path=customXml/item1.xml><?xml version="1.0" encoding="utf-8"?>
+<b:Sources xmlns:b="http://schemas.openxmlformats.org/officeDocument/2006/bibliography" xmlns="http://schemas.openxmlformats.org/officeDocument/2006/bibliography" SelectedStyle="\APASixthEditionOfficeOnline.xsl" StyleName="APA" Version="6"/>
+</file>
+
+<file path=customXml/item2.xml><?xml version="1.0" encoding="utf-8"?>
 <?mso-contentType ?>
 <FormTemplates xmlns="http://schemas.microsoft.com/sharepoint/v3/contenttype/forms">
   <Display>DocumentLibraryForm</Display>
@@ -20172,22 +20402,7 @@
 </FormTemplates>
 </file>
 
-<file path=customXml/item2.xml><?xml version="1.0" encoding="utf-8"?>
-<b:Sources xmlns:b="http://schemas.openxmlformats.org/officeDocument/2006/bibliography" xmlns="http://schemas.openxmlformats.org/officeDocument/2006/bibliography" SelectedStyle="\APASixthEditionOfficeOnline.xsl" StyleName="APA" Version="6"/>
-</file>
-
 <file path=customXml/item3.xml><?xml version="1.0" encoding="utf-8"?>
-<p:properties xmlns:p="http://schemas.microsoft.com/office/2006/metadata/properties" xmlns:xsi="http://www.w3.org/2001/XMLSchema-instance" xmlns:pc="http://schemas.microsoft.com/office/infopath/2007/PartnerControls">
-  <documentManagement>
-    <TaxCatchAll xmlns="cb45339b-ced9-4d0d-8f64-77573914d53b" xsi:nil="true"/>
-    <lcf76f155ced4ddcb4097134ff3c332f xmlns="43a3ca16-9c26-4813-b83f-4aec9927b43f">
-      <Terms xmlns="http://schemas.microsoft.com/office/infopath/2007/PartnerControls"/>
-    </lcf76f155ced4ddcb4097134ff3c332f>
-  </documentManagement>
-</p:properties>
-</file>
-
-<file path=customXml/item4.xml><?xml version="1.0" encoding="utf-8"?>
 <ct:contentTypeSchema xmlns:ct="http://schemas.microsoft.com/office/2006/metadata/contentType" xmlns:ma="http://schemas.microsoft.com/office/2006/metadata/properties/metaAttributes" ct:_="" ma:_="" ma:contentTypeName="Documento" ma:contentTypeID="0x01010049282E1EDBE9234EA9E6D38F720E265F" ma:contentTypeVersion="15" ma:contentTypeDescription="Crear nuevo documento." ma:contentTypeScope="" ma:versionID="b31c7aa9eaf043a08b87120b3c4916e3">
   <xsd:schema xmlns:xsd="http://www.w3.org/2001/XMLSchema" xmlns:xs="http://www.w3.org/2001/XMLSchema" xmlns:p="http://schemas.microsoft.com/office/2006/metadata/properties" xmlns:ns2="cb45339b-ced9-4d0d-8f64-77573914d53b" xmlns:ns3="43a3ca16-9c26-4813-b83f-4aec9927b43f" targetNamespace="http://schemas.microsoft.com/office/2006/metadata/properties" ma:root="true" ma:fieldsID="3533d065b04d75c457075bc55f1f5315" ns2:_="" ns3:_="">
     <xsd:import namespace="cb45339b-ced9-4d0d-8f64-77573914d53b"/>
@@ -20422,7 +20637,26 @@
 </ct:contentTypeSchema>
 </file>
 
+<file path=customXml/item4.xml><?xml version="1.0" encoding="utf-8"?>
+<p:properties xmlns:p="http://schemas.microsoft.com/office/2006/metadata/properties" xmlns:xsi="http://www.w3.org/2001/XMLSchema-instance" xmlns:pc="http://schemas.microsoft.com/office/infopath/2007/PartnerControls">
+  <documentManagement>
+    <TaxCatchAll xmlns="cb45339b-ced9-4d0d-8f64-77573914d53b" xsi:nil="true"/>
+    <lcf76f155ced4ddcb4097134ff3c332f xmlns="43a3ca16-9c26-4813-b83f-4aec9927b43f">
+      <Terms xmlns="http://schemas.microsoft.com/office/infopath/2007/PartnerControls"/>
+    </lcf76f155ced4ddcb4097134ff3c332f>
+  </documentManagement>
+</p:properties>
+</file>
+
 <file path=customXml/itemProps1.xml><?xml version="1.0" encoding="utf-8"?>
+<ds:datastoreItem xmlns:ds="http://schemas.openxmlformats.org/officeDocument/2006/customXml" ds:itemID="{A9F2CEBA-C824-4C86-81A8-E32CBD0EB92D}">
+  <ds:schemaRefs>
+    <ds:schemaRef ds:uri="http://schemas.openxmlformats.org/officeDocument/2006/bibliography"/>
+  </ds:schemaRefs>
+</ds:datastoreItem>
+</file>
+
+<file path=customXml/itemProps2.xml><?xml version="1.0" encoding="utf-8"?>
 <ds:datastoreItem xmlns:ds="http://schemas.openxmlformats.org/officeDocument/2006/customXml" ds:itemID="{D00A4A46-BDBD-48AC-87B9-2BA42D9CC06F}">
   <ds:schemaRefs>
     <ds:schemaRef ds:uri="http://schemas.microsoft.com/sharepoint/v3/contenttype/forms"/>
@@ -20430,26 +20664,7 @@
 </ds:datastoreItem>
 </file>
 
-<file path=customXml/itemProps2.xml><?xml version="1.0" encoding="utf-8"?>
-<ds:datastoreItem xmlns:ds="http://schemas.openxmlformats.org/officeDocument/2006/customXml" ds:itemID="{A9F2CEBA-C824-4C86-81A8-E32CBD0EB92D}">
-  <ds:schemaRefs>
-    <ds:schemaRef ds:uri="http://schemas.openxmlformats.org/officeDocument/2006/bibliography"/>
-  </ds:schemaRefs>
-</ds:datastoreItem>
-</file>
-
 <file path=customXml/itemProps3.xml><?xml version="1.0" encoding="utf-8"?>
-<ds:datastoreItem xmlns:ds="http://schemas.openxmlformats.org/officeDocument/2006/customXml" ds:itemID="{26259216-AD86-464A-AEAD-95B1F9E17392}">
-  <ds:schemaRefs>
-    <ds:schemaRef ds:uri="http://schemas.microsoft.com/office/2006/metadata/properties"/>
-    <ds:schemaRef ds:uri="http://schemas.microsoft.com/office/infopath/2007/PartnerControls"/>
-    <ds:schemaRef ds:uri="cb45339b-ced9-4d0d-8f64-77573914d53b"/>
-    <ds:schemaRef ds:uri="43a3ca16-9c26-4813-b83f-4aec9927b43f"/>
-  </ds:schemaRefs>
-</ds:datastoreItem>
-</file>
-
-<file path=customXml/itemProps4.xml><?xml version="1.0" encoding="utf-8"?>
 <ds:datastoreItem xmlns:ds="http://schemas.openxmlformats.org/officeDocument/2006/customXml" ds:itemID="{0BC4A0A4-89EA-4C0C-9011-C1B351E892BC}">
   <ds:schemaRefs>
     <ds:schemaRef ds:uri="http://schemas.microsoft.com/office/2006/metadata/contentType"/>
@@ -20466,4 +20681,15 @@
     <ds:schemaRef ds:uri="http://schemas.microsoft.com/internal/obd"/>
   </ds:schemaRefs>
 </ds:datastoreItem>
+</file>
+
+<file path=customXml/itemProps4.xml><?xml version="1.0" encoding="utf-8"?>
+<ds:datastoreItem xmlns:ds="http://schemas.openxmlformats.org/officeDocument/2006/customXml" ds:itemID="{26259216-AD86-464A-AEAD-95B1F9E17392}">
+  <ds:schemaRefs>
+    <ds:schemaRef ds:uri="http://schemas.microsoft.com/office/2006/metadata/properties"/>
+    <ds:schemaRef ds:uri="http://schemas.microsoft.com/office/infopath/2007/PartnerControls"/>
+    <ds:schemaRef ds:uri="cb45339b-ced9-4d0d-8f64-77573914d53b"/>
+    <ds:schemaRef ds:uri="43a3ca16-9c26-4813-b83f-4aec9927b43f"/>
+  </ds:schemaRefs>
+</ds:datastoreItem>
 </file>
</xml_diff>

<commit_message>
[FIX] Validacion REPO v1.1
</commit_message>
<xml_diff>
--- a/fuentes/CF3_41730034_DU.docx
+++ b/fuentes/CF3_41730034_DU.docx
@@ -10500,7 +10500,14 @@
           <w:bdr w:val="none" w:sz="0" w:space="0" w:color="auto" w:frame="1"/>
           <w:lang w:eastAsia="es-CO"/>
         </w:rPr>
-        <w:t>estrategias de Entornos Saludables que promueven acciones intersectoriales para mejorar la salud a través de la creación de espacios seguros, saludables y sostenibles en la escuela, el hogar, el trabajo y la comunidad.</w:t>
+        <w:t>E</w:t>
+      </w:r>
+      <w:r>
+        <w:rPr>
+          <w:bdr w:val="none" w:sz="0" w:space="0" w:color="auto" w:frame="1"/>
+          <w:lang w:eastAsia="es-CO"/>
+        </w:rPr>
+        <w:t>strategias de Entornos Saludables que promueven acciones intersectoriales para mejorar la salud a través de la creación de espacios seguros, saludables y sostenibles en la escuela, el hogar, el trabajo y la comunidad.</w:t>
       </w:r>
     </w:p>
     <w:p>
@@ -11786,7 +11793,7 @@
         <v:path o:extrusionok="f" gradientshapeok="t" o:connecttype="rect"/>
         <o:lock v:ext="edit" aspectratio="t"/>
       </v:shapetype>
-      <v:shape id="_x0000_i1164" type="#_x0000_t75" style="width:12pt;height:12pt" o:bullet="t">
+      <v:shape id="_x0000_i1036" type="#_x0000_t75" style="width:12.15pt;height:12.15pt" o:bullet="t">
         <v:imagedata r:id="rId1" o:title="mso8C56"/>
       </v:shape>
     </w:pict>
@@ -19137,7 +19144,6 @@
   <w:style w:type="character" w:default="1" w:styleId="Fuentedeprrafopredeter">
     <w:name w:val="Default Paragraph Font"/>
     <w:uiPriority w:val="1"/>
-    <w:semiHidden/>
     <w:unhideWhenUsed/>
   </w:style>
   <w:style w:type="table" w:default="1" w:styleId="Tablanormal">
@@ -20390,10 +20396,6 @@
 </file>
 
 <file path=customXml/item1.xml><?xml version="1.0" encoding="utf-8"?>
-<b:Sources xmlns:b="http://schemas.openxmlformats.org/officeDocument/2006/bibliography" xmlns="http://schemas.openxmlformats.org/officeDocument/2006/bibliography" SelectedStyle="\APASixthEditionOfficeOnline.xsl" StyleName="APA" Version="6"/>
-</file>
-
-<file path=customXml/item2.xml><?xml version="1.0" encoding="utf-8"?>
 <?mso-contentType ?>
 <FormTemplates xmlns="http://schemas.microsoft.com/sharepoint/v3/contenttype/forms">
   <Display>DocumentLibraryForm</Display>
@@ -20402,7 +20404,22 @@
 </FormTemplates>
 </file>
 
+<file path=customXml/item2.xml><?xml version="1.0" encoding="utf-8"?>
+<b:Sources xmlns:b="http://schemas.openxmlformats.org/officeDocument/2006/bibliography" xmlns="http://schemas.openxmlformats.org/officeDocument/2006/bibliography" SelectedStyle="\APASixthEditionOfficeOnline.xsl" StyleName="APA" Version="6"/>
+</file>
+
 <file path=customXml/item3.xml><?xml version="1.0" encoding="utf-8"?>
+<p:properties xmlns:p="http://schemas.microsoft.com/office/2006/metadata/properties" xmlns:xsi="http://www.w3.org/2001/XMLSchema-instance" xmlns:pc="http://schemas.microsoft.com/office/infopath/2007/PartnerControls">
+  <documentManagement>
+    <TaxCatchAll xmlns="cb45339b-ced9-4d0d-8f64-77573914d53b" xsi:nil="true"/>
+    <lcf76f155ced4ddcb4097134ff3c332f xmlns="43a3ca16-9c26-4813-b83f-4aec9927b43f">
+      <Terms xmlns="http://schemas.microsoft.com/office/infopath/2007/PartnerControls"/>
+    </lcf76f155ced4ddcb4097134ff3c332f>
+  </documentManagement>
+</p:properties>
+</file>
+
+<file path=customXml/item4.xml><?xml version="1.0" encoding="utf-8"?>
 <ct:contentTypeSchema xmlns:ct="http://schemas.microsoft.com/office/2006/metadata/contentType" xmlns:ma="http://schemas.microsoft.com/office/2006/metadata/properties/metaAttributes" ct:_="" ma:_="" ma:contentTypeName="Documento" ma:contentTypeID="0x01010049282E1EDBE9234EA9E6D38F720E265F" ma:contentTypeVersion="15" ma:contentTypeDescription="Crear nuevo documento." ma:contentTypeScope="" ma:versionID="b31c7aa9eaf043a08b87120b3c4916e3">
   <xsd:schema xmlns:xsd="http://www.w3.org/2001/XMLSchema" xmlns:xs="http://www.w3.org/2001/XMLSchema" xmlns:p="http://schemas.microsoft.com/office/2006/metadata/properties" xmlns:ns2="cb45339b-ced9-4d0d-8f64-77573914d53b" xmlns:ns3="43a3ca16-9c26-4813-b83f-4aec9927b43f" targetNamespace="http://schemas.microsoft.com/office/2006/metadata/properties" ma:root="true" ma:fieldsID="3533d065b04d75c457075bc55f1f5315" ns2:_="" ns3:_="">
     <xsd:import namespace="cb45339b-ced9-4d0d-8f64-77573914d53b"/>
@@ -20637,18 +20654,15 @@
 </ct:contentTypeSchema>
 </file>
 
-<file path=customXml/item4.xml><?xml version="1.0" encoding="utf-8"?>
-<p:properties xmlns:p="http://schemas.microsoft.com/office/2006/metadata/properties" xmlns:xsi="http://www.w3.org/2001/XMLSchema-instance" xmlns:pc="http://schemas.microsoft.com/office/infopath/2007/PartnerControls">
-  <documentManagement>
-    <TaxCatchAll xmlns="cb45339b-ced9-4d0d-8f64-77573914d53b" xsi:nil="true"/>
-    <lcf76f155ced4ddcb4097134ff3c332f xmlns="43a3ca16-9c26-4813-b83f-4aec9927b43f">
-      <Terms xmlns="http://schemas.microsoft.com/office/infopath/2007/PartnerControls"/>
-    </lcf76f155ced4ddcb4097134ff3c332f>
-  </documentManagement>
-</p:properties>
+<file path=customXml/itemProps1.xml><?xml version="1.0" encoding="utf-8"?>
+<ds:datastoreItem xmlns:ds="http://schemas.openxmlformats.org/officeDocument/2006/customXml" ds:itemID="{D00A4A46-BDBD-48AC-87B9-2BA42D9CC06F}">
+  <ds:schemaRefs>
+    <ds:schemaRef ds:uri="http://schemas.microsoft.com/sharepoint/v3/contenttype/forms"/>
+  </ds:schemaRefs>
+</ds:datastoreItem>
 </file>
 
-<file path=customXml/itemProps1.xml><?xml version="1.0" encoding="utf-8"?>
+<file path=customXml/itemProps2.xml><?xml version="1.0" encoding="utf-8"?>
 <ds:datastoreItem xmlns:ds="http://schemas.openxmlformats.org/officeDocument/2006/customXml" ds:itemID="{A9F2CEBA-C824-4C86-81A8-E32CBD0EB92D}">
   <ds:schemaRefs>
     <ds:schemaRef ds:uri="http://schemas.openxmlformats.org/officeDocument/2006/bibliography"/>
@@ -20656,15 +20670,18 @@
 </ds:datastoreItem>
 </file>
 
-<file path=customXml/itemProps2.xml><?xml version="1.0" encoding="utf-8"?>
-<ds:datastoreItem xmlns:ds="http://schemas.openxmlformats.org/officeDocument/2006/customXml" ds:itemID="{D00A4A46-BDBD-48AC-87B9-2BA42D9CC06F}">
+<file path=customXml/itemProps3.xml><?xml version="1.0" encoding="utf-8"?>
+<ds:datastoreItem xmlns:ds="http://schemas.openxmlformats.org/officeDocument/2006/customXml" ds:itemID="{26259216-AD86-464A-AEAD-95B1F9E17392}">
   <ds:schemaRefs>
-    <ds:schemaRef ds:uri="http://schemas.microsoft.com/sharepoint/v3/contenttype/forms"/>
+    <ds:schemaRef ds:uri="http://schemas.microsoft.com/office/2006/metadata/properties"/>
+    <ds:schemaRef ds:uri="http://schemas.microsoft.com/office/infopath/2007/PartnerControls"/>
+    <ds:schemaRef ds:uri="cb45339b-ced9-4d0d-8f64-77573914d53b"/>
+    <ds:schemaRef ds:uri="43a3ca16-9c26-4813-b83f-4aec9927b43f"/>
   </ds:schemaRefs>
 </ds:datastoreItem>
 </file>
 
-<file path=customXml/itemProps3.xml><?xml version="1.0" encoding="utf-8"?>
+<file path=customXml/itemProps4.xml><?xml version="1.0" encoding="utf-8"?>
 <ds:datastoreItem xmlns:ds="http://schemas.openxmlformats.org/officeDocument/2006/customXml" ds:itemID="{0BC4A0A4-89EA-4C0C-9011-C1B351E892BC}">
   <ds:schemaRefs>
     <ds:schemaRef ds:uri="http://schemas.microsoft.com/office/2006/metadata/contentType"/>
@@ -20681,15 +20698,4 @@
     <ds:schemaRef ds:uri="http://schemas.microsoft.com/internal/obd"/>
   </ds:schemaRefs>
 </ds:datastoreItem>
-</file>
-
-<file path=customXml/itemProps4.xml><?xml version="1.0" encoding="utf-8"?>
-<ds:datastoreItem xmlns:ds="http://schemas.openxmlformats.org/officeDocument/2006/customXml" ds:itemID="{26259216-AD86-464A-AEAD-95B1F9E17392}">
-  <ds:schemaRefs>
-    <ds:schemaRef ds:uri="http://schemas.microsoft.com/office/2006/metadata/properties"/>
-    <ds:schemaRef ds:uri="http://schemas.microsoft.com/office/infopath/2007/PartnerControls"/>
-    <ds:schemaRef ds:uri="cb45339b-ced9-4d0d-8f64-77573914d53b"/>
-    <ds:schemaRef ds:uri="43a3ca16-9c26-4813-b83f-4aec9927b43f"/>
-  </ds:schemaRefs>
-</ds:datastoreItem>
 </file>
</xml_diff>

<commit_message>
[FIX] Validacio REPO v1.3
</commit_message>
<xml_diff>
--- a/fuentes/CF3_41730034_DU.docx
+++ b/fuentes/CF3_41730034_DU.docx
@@ -718,7 +718,7 @@
                 <w:noProof/>
                 <w:webHidden/>
               </w:rPr>
-              <w:t>5</w:t>
+              <w:t>4</w:t>
             </w:r>
             <w:r>
               <w:rPr>
@@ -2130,7 +2130,19 @@
               <w:rPr>
                 <w:lang w:val="es-419" w:eastAsia="es-CO"/>
               </w:rPr>
-              <w:t xml:space="preserve"> de Integración de la Estrategia de Salud Pública Integrada (ESPI) según modelo de gestión local. Este espacio tiene como objetivo fortalecer la promoción de la salud, entendida como un proceso esencial para potenciar las capacidades individuales y colectivas, mejorar la calidad de vida y prevenir enfermedades, más allá del enfoque tradicional centrado únicamente en la atención médica.</w:t>
+              <w:t xml:space="preserve"> </w:t>
+            </w:r>
+            <w:r>
+              <w:rPr>
+                <w:lang w:val="es-419" w:eastAsia="es-CO"/>
+              </w:rPr>
+              <w:t xml:space="preserve">Integración EES-AIEPI </w:t>
+            </w:r>
+            <w:r>
+              <w:rPr>
+                <w:lang w:val="es-419" w:eastAsia="es-CO"/>
+              </w:rPr>
+              <w:t>según modelo de gestión local. Este espacio tiene como objetivo fortalecer la promoción de la salud, entendida como un proceso esencial para potenciar las capacidades individuales y colectivas, mejorar la calidad de vida y prevenir enfermedades, más allá del enfoque tradicional centrado únicamente en la atención médica.</w:t>
             </w:r>
           </w:p>
           <w:p>
@@ -2143,14 +2155,14 @@
               <w:rPr>
                 <w:lang w:val="es-419" w:eastAsia="es-CO"/>
               </w:rPr>
-              <w:t xml:space="preserve">La promoción de la salud impulsa transformaciones estructurales en la sociedad, fomentando el bienestar integral de las personas. A través de estrategias educativas, se busca difundir conocimientos y promover prácticas saludables que permitan a la población tomar decisiones informadas sobre su salud y la de su </w:t>
+              <w:t xml:space="preserve">La promoción de la salud impulsa transformaciones estructurales en la sociedad, fomentando el bienestar integral de las personas. A través de estrategias educativas, se busca difundir conocimientos y promover prácticas saludables que permitan a la población tomar decisiones informadas sobre su salud y la de su comunidad. Este enfoque abarca no solo la prevención de enfermedades, sino </w:t>
             </w:r>
             <w:r>
               <w:rPr>
                 <w:lang w:val="es-419" w:eastAsia="es-CO"/>
               </w:rPr>
               <w:lastRenderedPageBreak/>
-              <w:t>comunidad. Este enfoque abarca no solo la prevención de enfermedades, sino también la adopción de hábitos de vida saludables y el acceso equitativo a servicios de salud de calidad.</w:t>
+              <w:t>también la adopción de hábitos de vida saludables y el acceso equitativo a servicios de salud de calidad.</w:t>
             </w:r>
           </w:p>
           <w:p>
@@ -2189,14 +2201,7 @@
               <w:rPr>
                 <w:lang w:val="es-419" w:eastAsia="es-CO"/>
               </w:rPr>
-              <w:t xml:space="preserve">La integración de estrategias de salud comunitaria, como la Atención Integrada a las Enfermedades Prevalentes de la Infancia (AIEPI) y la Estrategia de Entornos Saludables (EES), es fundamental para asegurar una atención integral y equitativa. Estas iniciativas fortalecen la prevención, el acceso a servicios de calidad y la participación activa de la comunidad en el cuidado de la salud. Al promover entornos </w:t>
-            </w:r>
-            <w:r>
-              <w:rPr>
-                <w:lang w:val="es-419" w:eastAsia="es-CO"/>
-              </w:rPr>
-              <w:lastRenderedPageBreak/>
-              <w:t>saludables, educación en salud y la adopción de prácticas preventivas, se logra un impacto positivo y sostenible en la calidad de vida de las personas.</w:t>
+              <w:t>La integración de estrategias de salud comunitaria, como la Atención Integrada a las Enfermedades Prevalentes de la Infancia (AIEPI) y la Estrategia de Entornos Saludables (EES), es fundamental para asegurar una atención integral y equitativa. Estas iniciativas fortalecen la prevención, el acceso a servicios de calidad y la participación activa de la comunidad en el cuidado de la salud. Al promover entornos saludables, educación en salud y la adopción de prácticas preventivas, se logra un impacto positivo y sostenible en la calidad de vida de las personas.</w:t>
             </w:r>
           </w:p>
           <w:p>
@@ -2209,6 +2214,7 @@
               <w:rPr>
                 <w:lang w:val="es-419" w:eastAsia="es-CO"/>
               </w:rPr>
+              <w:lastRenderedPageBreak/>
               <w:t>La corresponsabilidad entre el sector salud, la comunidad y otros actores sociales es clave para consolidar sistemas de salud más eficientes y adaptados a las necesidades de la población. En este contexto, la promoción de la salud deja de ser solo una estrategia y se convierte en un compromiso colectivo para garantizar el bienestar de las generaciones presentes y futuras.</w:t>
             </w:r>
           </w:p>
@@ -2312,21 +2318,21 @@
       </w:pPr>
       <w:bookmarkStart w:id="1" w:name="_Toc204004100"/>
       <w:r>
+        <w:t>Desarrollo humano sostenible y calidad de vida</w:t>
+      </w:r>
+      <w:bookmarkEnd w:id="1"/>
+    </w:p>
+    <w:p>
+      <w:pPr>
+        <w:rPr>
+          <w:lang w:val="es-419" w:eastAsia="es-CO"/>
+        </w:rPr>
+      </w:pPr>
+      <w:r>
+        <w:rPr>
+          <w:lang w:val="es-419" w:eastAsia="es-CO"/>
+        </w:rPr>
         <w:lastRenderedPageBreak/>
-        <w:t>Desarrollo humano sostenible y calidad de vida</w:t>
-      </w:r>
-      <w:bookmarkEnd w:id="1"/>
-    </w:p>
-    <w:p>
-      <w:pPr>
-        <w:rPr>
-          <w:lang w:val="es-419" w:eastAsia="es-CO"/>
-        </w:rPr>
-      </w:pPr>
-      <w:r>
-        <w:rPr>
-          <w:lang w:val="es-419" w:eastAsia="es-CO"/>
-        </w:rPr>
         <w:t xml:space="preserve">El desarrollo humano sostenible es un proceso que busca ampliar las oportunidades y capacidades de las personas para alcanzar una vida digna, saludable y plena, según el programa de las </w:t>
       </w:r>
       <w:r>
@@ -2431,8 +2437,14 @@
         <w:rPr>
           <w:lang w:eastAsia="es-CO"/>
         </w:rPr>
+        <w:t xml:space="preserve">Este concepto dinámico vincula las dimensiones económica, social, política, cultural y ambiental del desarrollo, considerando la calidad de vida y la satisfacción de </w:t>
+      </w:r>
+      <w:r>
+        <w:rPr>
+          <w:lang w:eastAsia="es-CO"/>
+        </w:rPr>
         <w:lastRenderedPageBreak/>
-        <w:t>Este concepto dinámico vincula las dimensiones económica, social, política, cultural y ambiental del desarrollo, considerando la calidad de vida y la satisfacción de las expectativas personales y colectivas, por ello, reconoce a las personas y comunidades como sujetos activos del desarrollo, mediante la creación y fortalecimiento de sus oportunidades.</w:t>
+        <w:t>las expectativas personales y colectivas, por ello, reconoce a las personas y comunidades como sujetos activos del desarrollo, mediante la creación y fortalecimiento de sus oportunidades.</w:t>
       </w:r>
     </w:p>
     <w:p>
@@ -2515,14 +2527,20 @@
           <w:bCs/>
           <w:lang w:eastAsia="es-CO"/>
         </w:rPr>
+        <w:t>Vivienda saludable:</w:t>
+      </w:r>
+      <w:r>
+        <w:rPr>
+          <w:lang w:eastAsia="es-CO"/>
+        </w:rPr>
+        <w:t xml:space="preserve"> reconoce a la vivienda como un espacio que influye directamente en la salud y bienestar de las personas, fomenta la participación de la </w:t>
+      </w:r>
+      <w:r>
+        <w:rPr>
+          <w:lang w:eastAsia="es-CO"/>
+        </w:rPr>
         <w:lastRenderedPageBreak/>
-        <w:t>Vivienda saludable:</w:t>
-      </w:r>
-      <w:r>
-        <w:rPr>
-          <w:lang w:eastAsia="es-CO"/>
-        </w:rPr>
-        <w:t> reconoce a la vivienda como un espacio que influye directamente en la salud y bienestar de las personas, fomenta la participación de la familia y la comunidad para identificar riesgos, mejorar las condiciones del hogar y su entorno, y fortalecer factores protectores, también impulsa la creación de redes de apoyo social y acciones para reducir riesgos ambientales, garantizando un ambiente físico, psicológico y social adecuado.</w:t>
+        <w:t>familia y la comunidad para identificar riesgos, mejorar las condiciones del hogar y su entorno, y fortalecer factores protectores, también impulsa la creación de redes de apoyo social y acciones para reducir riesgos ambientales, garantizando un ambiente físico, psicológico y social adecuado.</w:t>
       </w:r>
     </w:p>
     <w:p>
@@ -2625,8 +2643,14 @@
         <w:rPr>
           <w:lang w:eastAsia="es-CO"/>
         </w:rPr>
+        <w:t xml:space="preserve">Esta declaración establece que el desarrollo es un derecho humano inalienable, lo que significa que ninguna persona puede ser privada de él, y además reconoce la </w:t>
+      </w:r>
+      <w:r>
+        <w:rPr>
+          <w:lang w:eastAsia="es-CO"/>
+        </w:rPr>
         <w:lastRenderedPageBreak/>
-        <w:t>Esta declaración establece que el desarrollo es un derecho humano inalienable, lo que significa que ninguna persona puede ser privada de él, y además reconoce la soberanía plena de los pueblos sobre sus recursos, otros tratados y conferencias internacionales han reforzado esta visión, destacando que el desarrollo humano implica la garantía y ejercicio efectivo de los derechos humanos.</w:t>
+        <w:t>soberanía plena de los pueblos sobre sus recursos, otros tratados y conferencias internacionales han reforzado esta visión, destacando que el desarrollo humano implica la garantía y ejercicio efectivo de los derechos humanos.</w:t>
       </w:r>
     </w:p>
     <w:p>
@@ -2822,7 +2846,6 @@
           <w:bCs/>
           <w:lang w:eastAsia="es-CO"/>
         </w:rPr>
-        <w:lastRenderedPageBreak/>
         <w:t>Derecho a ser el sujeto central del desarrollo</w:t>
       </w:r>
     </w:p>
@@ -2838,6 +2861,7 @@
         <w:rPr>
           <w:lang w:eastAsia="es-CO"/>
         </w:rPr>
+        <w:lastRenderedPageBreak/>
         <w:t>Las personas deben estar en el centro del desarrollo; su bienestar es la prioridad.</w:t>
       </w:r>
     </w:p>
@@ -11793,7 +11817,7 @@
         <v:path o:extrusionok="f" gradientshapeok="t" o:connecttype="rect"/>
         <o:lock v:ext="edit" aspectratio="t"/>
       </v:shapetype>
-      <v:shape id="_x0000_i1036" type="#_x0000_t75" style="width:12.15pt;height:12.15pt" o:bullet="t">
+      <v:shape id="_x0000_i1045" type="#_x0000_t75" style="width:12.15pt;height:12.15pt" o:bullet="t">
         <v:imagedata r:id="rId1" o:title="mso8C56"/>
       </v:shape>
     </w:pict>
@@ -19144,6 +19168,7 @@
   <w:style w:type="character" w:default="1" w:styleId="Fuentedeprrafopredeter">
     <w:name w:val="Default Paragraph Font"/>
     <w:uiPriority w:val="1"/>
+    <w:semiHidden/>
     <w:unhideWhenUsed/>
   </w:style>
   <w:style w:type="table" w:default="1" w:styleId="Tablanormal">
@@ -20396,6 +20421,10 @@
 </file>
 
 <file path=customXml/item1.xml><?xml version="1.0" encoding="utf-8"?>
+<b:Sources xmlns:b="http://schemas.openxmlformats.org/officeDocument/2006/bibliography" xmlns="http://schemas.openxmlformats.org/officeDocument/2006/bibliography" SelectedStyle="\APASixthEditionOfficeOnline.xsl" StyleName="APA" Version="6"/>
+</file>
+
+<file path=customXml/item2.xml><?xml version="1.0" encoding="utf-8"?>
 <?mso-contentType ?>
 <FormTemplates xmlns="http://schemas.microsoft.com/sharepoint/v3/contenttype/forms">
   <Display>DocumentLibraryForm</Display>
@@ -20404,22 +20433,7 @@
 </FormTemplates>
 </file>
 
-<file path=customXml/item2.xml><?xml version="1.0" encoding="utf-8"?>
-<b:Sources xmlns:b="http://schemas.openxmlformats.org/officeDocument/2006/bibliography" xmlns="http://schemas.openxmlformats.org/officeDocument/2006/bibliography" SelectedStyle="\APASixthEditionOfficeOnline.xsl" StyleName="APA" Version="6"/>
-</file>
-
 <file path=customXml/item3.xml><?xml version="1.0" encoding="utf-8"?>
-<p:properties xmlns:p="http://schemas.microsoft.com/office/2006/metadata/properties" xmlns:xsi="http://www.w3.org/2001/XMLSchema-instance" xmlns:pc="http://schemas.microsoft.com/office/infopath/2007/PartnerControls">
-  <documentManagement>
-    <TaxCatchAll xmlns="cb45339b-ced9-4d0d-8f64-77573914d53b" xsi:nil="true"/>
-    <lcf76f155ced4ddcb4097134ff3c332f xmlns="43a3ca16-9c26-4813-b83f-4aec9927b43f">
-      <Terms xmlns="http://schemas.microsoft.com/office/infopath/2007/PartnerControls"/>
-    </lcf76f155ced4ddcb4097134ff3c332f>
-  </documentManagement>
-</p:properties>
-</file>
-
-<file path=customXml/item4.xml><?xml version="1.0" encoding="utf-8"?>
 <ct:contentTypeSchema xmlns:ct="http://schemas.microsoft.com/office/2006/metadata/contentType" xmlns:ma="http://schemas.microsoft.com/office/2006/metadata/properties/metaAttributes" ct:_="" ma:_="" ma:contentTypeName="Documento" ma:contentTypeID="0x01010049282E1EDBE9234EA9E6D38F720E265F" ma:contentTypeVersion="15" ma:contentTypeDescription="Crear nuevo documento." ma:contentTypeScope="" ma:versionID="b31c7aa9eaf043a08b87120b3c4916e3">
   <xsd:schema xmlns:xsd="http://www.w3.org/2001/XMLSchema" xmlns:xs="http://www.w3.org/2001/XMLSchema" xmlns:p="http://schemas.microsoft.com/office/2006/metadata/properties" xmlns:ns2="cb45339b-ced9-4d0d-8f64-77573914d53b" xmlns:ns3="43a3ca16-9c26-4813-b83f-4aec9927b43f" targetNamespace="http://schemas.microsoft.com/office/2006/metadata/properties" ma:root="true" ma:fieldsID="3533d065b04d75c457075bc55f1f5315" ns2:_="" ns3:_="">
     <xsd:import namespace="cb45339b-ced9-4d0d-8f64-77573914d53b"/>
@@ -20654,7 +20668,26 @@
 </ct:contentTypeSchema>
 </file>
 
+<file path=customXml/item4.xml><?xml version="1.0" encoding="utf-8"?>
+<p:properties xmlns:p="http://schemas.microsoft.com/office/2006/metadata/properties" xmlns:xsi="http://www.w3.org/2001/XMLSchema-instance" xmlns:pc="http://schemas.microsoft.com/office/infopath/2007/PartnerControls">
+  <documentManagement>
+    <TaxCatchAll xmlns="cb45339b-ced9-4d0d-8f64-77573914d53b" xsi:nil="true"/>
+    <lcf76f155ced4ddcb4097134ff3c332f xmlns="43a3ca16-9c26-4813-b83f-4aec9927b43f">
+      <Terms xmlns="http://schemas.microsoft.com/office/infopath/2007/PartnerControls"/>
+    </lcf76f155ced4ddcb4097134ff3c332f>
+  </documentManagement>
+</p:properties>
+</file>
+
 <file path=customXml/itemProps1.xml><?xml version="1.0" encoding="utf-8"?>
+<ds:datastoreItem xmlns:ds="http://schemas.openxmlformats.org/officeDocument/2006/customXml" ds:itemID="{A9F2CEBA-C824-4C86-81A8-E32CBD0EB92D}">
+  <ds:schemaRefs>
+    <ds:schemaRef ds:uri="http://schemas.openxmlformats.org/officeDocument/2006/bibliography"/>
+  </ds:schemaRefs>
+</ds:datastoreItem>
+</file>
+
+<file path=customXml/itemProps2.xml><?xml version="1.0" encoding="utf-8"?>
 <ds:datastoreItem xmlns:ds="http://schemas.openxmlformats.org/officeDocument/2006/customXml" ds:itemID="{D00A4A46-BDBD-48AC-87B9-2BA42D9CC06F}">
   <ds:schemaRefs>
     <ds:schemaRef ds:uri="http://schemas.microsoft.com/sharepoint/v3/contenttype/forms"/>
@@ -20662,26 +20695,7 @@
 </ds:datastoreItem>
 </file>
 
-<file path=customXml/itemProps2.xml><?xml version="1.0" encoding="utf-8"?>
-<ds:datastoreItem xmlns:ds="http://schemas.openxmlformats.org/officeDocument/2006/customXml" ds:itemID="{A9F2CEBA-C824-4C86-81A8-E32CBD0EB92D}">
-  <ds:schemaRefs>
-    <ds:schemaRef ds:uri="http://schemas.openxmlformats.org/officeDocument/2006/bibliography"/>
-  </ds:schemaRefs>
-</ds:datastoreItem>
-</file>
-
 <file path=customXml/itemProps3.xml><?xml version="1.0" encoding="utf-8"?>
-<ds:datastoreItem xmlns:ds="http://schemas.openxmlformats.org/officeDocument/2006/customXml" ds:itemID="{26259216-AD86-464A-AEAD-95B1F9E17392}">
-  <ds:schemaRefs>
-    <ds:schemaRef ds:uri="http://schemas.microsoft.com/office/2006/metadata/properties"/>
-    <ds:schemaRef ds:uri="http://schemas.microsoft.com/office/infopath/2007/PartnerControls"/>
-    <ds:schemaRef ds:uri="cb45339b-ced9-4d0d-8f64-77573914d53b"/>
-    <ds:schemaRef ds:uri="43a3ca16-9c26-4813-b83f-4aec9927b43f"/>
-  </ds:schemaRefs>
-</ds:datastoreItem>
-</file>
-
-<file path=customXml/itemProps4.xml><?xml version="1.0" encoding="utf-8"?>
 <ds:datastoreItem xmlns:ds="http://schemas.openxmlformats.org/officeDocument/2006/customXml" ds:itemID="{0BC4A0A4-89EA-4C0C-9011-C1B351E892BC}">
   <ds:schemaRefs>
     <ds:schemaRef ds:uri="http://schemas.microsoft.com/office/2006/metadata/contentType"/>
@@ -20698,4 +20712,15 @@
     <ds:schemaRef ds:uri="http://schemas.microsoft.com/internal/obd"/>
   </ds:schemaRefs>
 </ds:datastoreItem>
+</file>
+
+<file path=customXml/itemProps4.xml><?xml version="1.0" encoding="utf-8"?>
+<ds:datastoreItem xmlns:ds="http://schemas.openxmlformats.org/officeDocument/2006/customXml" ds:itemID="{26259216-AD86-464A-AEAD-95B1F9E17392}">
+  <ds:schemaRefs>
+    <ds:schemaRef ds:uri="http://schemas.microsoft.com/office/2006/metadata/properties"/>
+    <ds:schemaRef ds:uri="http://schemas.microsoft.com/office/infopath/2007/PartnerControls"/>
+    <ds:schemaRef ds:uri="cb45339b-ced9-4d0d-8f64-77573914d53b"/>
+    <ds:schemaRef ds:uri="43a3ca16-9c26-4813-b83f-4aec9927b43f"/>
+  </ds:schemaRefs>
+</ds:datastoreItem>
 </file>
</xml_diff>